<commit_message>
Add my stuff to individual task completion
</commit_message>
<xml_diff>
--- a/Non Code Items/Documents/F2024_IndividualTaskCompletion (P2) Updated.docx
+++ b/Non Code Items/Documents/F2024_IndividualTaskCompletion (P2) Updated.docx
@@ -1,6 +1,6 @@
 
 <file path=word/document.xml><?xml version="1.0" encoding="utf-8"?>
-<w:document xmlns:wpc="http://schemas.microsoft.com/office/word/2010/wordprocessingCanvas" xmlns:cx="http://schemas.microsoft.com/office/drawing/2014/chartex" xmlns:cx1="http://schemas.microsoft.com/office/drawing/2015/9/8/chartex" xmlns:cx2="http://schemas.microsoft.com/office/drawing/2015/10/21/chartex" xmlns:cx3="http://schemas.microsoft.com/office/drawing/2016/5/9/chartex" xmlns:cx4="http://schemas.microsoft.com/office/drawing/2016/5/10/chartex" xmlns:cx5="http://schemas.microsoft.com/office/drawing/2016/5/11/chartex" xmlns:cx6="http://schemas.microsoft.com/office/drawing/2016/5/12/chartex" xmlns:cx7="http://schemas.microsoft.com/office/drawing/2016/5/13/chartex" xmlns:cx8="http://schemas.microsoft.com/office/drawing/2016/5/14/chartex" xmlns:mc="http://schemas.openxmlformats.org/markup-compatibility/2006" xmlns:m="http://schemas.openxmlformats.org/officeDocument/2006/math" xmlns:aink="http://schemas.microsoft.com/office/drawing/2016/ink" xmlns:am3d="http://schemas.microsoft.com/office/drawing/2017/model3d" xmlns:oel="http://schemas.microsoft.com/office/2019/extlst" xmlns:r="http://schemas.openxmlformats.org/officeDocument/2006/relationships" xmlns:wp14="http://schemas.microsoft.com/office/word/2010/wordprocessingDrawing" xmlns:wp="http://schemas.openxmlformats.org/drawingml/2006/wordprocessingDrawing" xmlns:wpg="http://schemas.microsoft.com/office/word/2010/wordprocessingGroup" xmlns:wpi="http://schemas.microsoft.com/office/word/2010/wordprocessingInk" xmlns:wps="http://schemas.microsoft.com/office/word/2010/wordprocessingShape" xmlns:o="urn:schemas-microsoft-com:office:office" xmlns:v="urn:schemas-microsoft-com:vml" xmlns:w10="urn:schemas-microsoft-com:office:word" xmlns:w="http://schemas.openxmlformats.org/wordprocessingml/2006/main" xmlns:w14="http://schemas.microsoft.com/office/word/2010/wordml" xmlns:w15="http://schemas.microsoft.com/office/word/2012/wordml" xmlns:w16cex="http://schemas.microsoft.com/office/word/2018/wordml/cex" xmlns:w16cid="http://schemas.microsoft.com/office/word/2016/wordml/cid" xmlns:w16="http://schemas.microsoft.com/office/word/2018/wordml" xmlns:w16sdtdh="http://schemas.microsoft.com/office/word/2020/wordml/sdtdatahash" xmlns:w16sdtfl="http://schemas.microsoft.com/office/word/2024/wordml/sdtformatlock" xmlns:w16se="http://schemas.microsoft.com/office/word/2015/wordml/symex" xmlns:w16du="http://schemas.microsoft.com/office/word/2023/wordml/word16du" xmlns:wne="http://schemas.microsoft.com/office/word/2006/wordml" mc:Ignorable="w14 w15 w16se w16cid w16 w16cex w16sdtdh w16sdtfl w16du wp14">
+<w:document xmlns:wpc="http://schemas.microsoft.com/office/word/2010/wordprocessingCanvas" xmlns:cx="http://schemas.microsoft.com/office/drawing/2014/chartex" xmlns:cx1="http://schemas.microsoft.com/office/drawing/2015/9/8/chartex" xmlns:cx2="http://schemas.microsoft.com/office/drawing/2015/10/21/chartex" xmlns:cx3="http://schemas.microsoft.com/office/drawing/2016/5/9/chartex" xmlns:cx4="http://schemas.microsoft.com/office/drawing/2016/5/10/chartex" xmlns:cx5="http://schemas.microsoft.com/office/drawing/2016/5/11/chartex" xmlns:cx6="http://schemas.microsoft.com/office/drawing/2016/5/12/chartex" xmlns:cx7="http://schemas.microsoft.com/office/drawing/2016/5/13/chartex" xmlns:cx8="http://schemas.microsoft.com/office/drawing/2016/5/14/chartex" xmlns:mc="http://schemas.openxmlformats.org/markup-compatibility/2006" xmlns:aink="http://schemas.microsoft.com/office/drawing/2016/ink" xmlns:am3d="http://schemas.microsoft.com/office/drawing/2017/model3d" xmlns:o="urn:schemas-microsoft-com:office:office" xmlns:oel="http://schemas.microsoft.com/office/2019/extlst" xmlns:r="http://schemas.openxmlformats.org/officeDocument/2006/relationships" xmlns:m="http://schemas.openxmlformats.org/officeDocument/2006/math" xmlns:v="urn:schemas-microsoft-com:vml" xmlns:wp14="http://schemas.microsoft.com/office/word/2010/wordprocessingDrawing" xmlns:wp="http://schemas.openxmlformats.org/drawingml/2006/wordprocessingDrawing" xmlns:w10="urn:schemas-microsoft-com:office:word" xmlns:w="http://schemas.openxmlformats.org/wordprocessingml/2006/main" xmlns:w14="http://schemas.microsoft.com/office/word/2010/wordml" xmlns:w15="http://schemas.microsoft.com/office/word/2012/wordml" xmlns:w16cex="http://schemas.microsoft.com/office/word/2018/wordml/cex" xmlns:w16cid="http://schemas.microsoft.com/office/word/2016/wordml/cid" xmlns:w16="http://schemas.microsoft.com/office/word/2018/wordml" xmlns:w16du="http://schemas.microsoft.com/office/word/2023/wordml/word16du" xmlns:w16sdtdh="http://schemas.microsoft.com/office/word/2020/wordml/sdtdatahash" xmlns:w16sdtfl="http://schemas.microsoft.com/office/word/2024/wordml/sdtformatlock" xmlns:w16se="http://schemas.microsoft.com/office/word/2015/wordml/symex" xmlns:wpg="http://schemas.microsoft.com/office/word/2010/wordprocessingGroup" xmlns:wpi="http://schemas.microsoft.com/office/word/2010/wordprocessingInk" xmlns:wne="http://schemas.microsoft.com/office/word/2006/wordml" xmlns:wps="http://schemas.microsoft.com/office/word/2010/wordprocessingShape" mc:Ignorable="w14 w15 w16se w16cid w16 w16cex w16sdtdh w16sdtfl w16du wp14">
   <w:body>
     <w:p>
       <w:pPr>
@@ -178,15 +178,7 @@
               </w:numPr>
             </w:pPr>
             <w:r>
-              <w:t xml:space="preserve">Updated the ERD in </w:t>
-            </w:r>
-            <w:proofErr w:type="spellStart"/>
-            <w:r>
-              <w:t>Lucidchart</w:t>
-            </w:r>
-            <w:proofErr w:type="spellEnd"/>
-            <w:r>
-              <w:t xml:space="preserve"> based on P1 presentation feedback. </w:t>
+              <w:t xml:space="preserve">Updated the ERD in Lucidchart based on P1 presentation feedback. </w:t>
             </w:r>
           </w:p>
           <w:p>
@@ -282,13 +274,8 @@
               </w:numPr>
             </w:pPr>
             <w:r>
-              <w:t xml:space="preserve">Established the database we would be using for our application with </w:t>
-            </w:r>
-            <w:proofErr w:type="spellStart"/>
-            <w:r>
-              <w:t>NocoDB</w:t>
-            </w:r>
-            <w:proofErr w:type="spellEnd"/>
+              <w:t>Established the database we would be using for our application with NocoDB</w:t>
+            </w:r>
           </w:p>
           <w:p>
             <w:pPr>
@@ -323,15 +310,7 @@
               </w:numPr>
             </w:pPr>
             <w:r>
-              <w:t xml:space="preserve">Personally, I had tasked myself with the issue of adding constraints to the database. It couldn’t have been done on </w:t>
-            </w:r>
-            <w:proofErr w:type="spellStart"/>
-            <w:r>
-              <w:t>NocoDB</w:t>
-            </w:r>
-            <w:proofErr w:type="spellEnd"/>
-            <w:r>
-              <w:t xml:space="preserve"> since you had to pay for it. I did it by adding another code file in the component’s folder. </w:t>
+              <w:t xml:space="preserve">Personally, I had tasked myself with the issue of adding constraints to the database. It couldn’t have been done on NocoDB since you had to pay for it. I did it by adding another code file in the component’s folder. </w:t>
             </w:r>
           </w:p>
           <w:p>
@@ -370,15 +349,7 @@
           </w:tcPr>
           <w:p>
             <w:r>
-              <w:t xml:space="preserve">The project relies on mock data so the </w:t>
-            </w:r>
-            <w:proofErr w:type="spellStart"/>
-            <w:r>
-              <w:t>ncrs</w:t>
-            </w:r>
-            <w:proofErr w:type="spellEnd"/>
-            <w:r>
-              <w:t xml:space="preserve"> can’t be edited yet</w:t>
+              <w:t>The project relies on mock data so the ncrs can’t be edited yet</w:t>
             </w:r>
           </w:p>
         </w:tc>
@@ -395,15 +366,7 @@
               </w:numPr>
             </w:pPr>
             <w:r>
-              <w:t xml:space="preserve">Added the page title description underneath it </w:t>
-            </w:r>
-            <w:proofErr w:type="gramStart"/>
-            <w:r>
-              <w:t>explaining</w:t>
-            </w:r>
-            <w:proofErr w:type="gramEnd"/>
-            <w:r>
-              <w:t xml:space="preserve"> what it does</w:t>
+              <w:t>Added the page title description underneath it explaining what it does</w:t>
             </w:r>
           </w:p>
           <w:p>
@@ -526,15 +489,7 @@
           </w:tcPr>
           <w:p>
             <w:r>
-              <w:t xml:space="preserve">-Test the website to make sure </w:t>
-            </w:r>
-            <w:proofErr w:type="gramStart"/>
-            <w:r>
-              <w:t>all of</w:t>
-            </w:r>
-            <w:proofErr w:type="gramEnd"/>
-            <w:r>
-              <w:t xml:space="preserve"> the pain points from the experience map were addressed.</w:t>
+              <w:t>-Test the website to make sure all of the pain points from the experience map were addressed.</w:t>
             </w:r>
           </w:p>
         </w:tc>
@@ -544,13 +499,8 @@
           </w:tcPr>
           <w:p>
             <w:r>
-              <w:t xml:space="preserve">-The experience map is </w:t>
-            </w:r>
-            <w:proofErr w:type="gramStart"/>
-            <w:r>
-              <w:t>completely finished</w:t>
-            </w:r>
-            <w:proofErr w:type="gramEnd"/>
+              <w:t>-The experience map is completely finished</w:t>
+            </w:r>
           </w:p>
           <w:p>
             <w:r>
@@ -712,26 +662,10 @@
               <w:t>Programmed re</w:t>
             </w:r>
             <w:r>
-              <w:t xml:space="preserve">cent </w:t>
-            </w:r>
-            <w:proofErr w:type="spellStart"/>
-            <w:r>
-              <w:t>ncrs</w:t>
-            </w:r>
-            <w:proofErr w:type="spellEnd"/>
-            <w:r>
-              <w:t xml:space="preserve"> table</w:t>
-            </w:r>
-            <w:r>
-              <w:t xml:space="preserve"> + edit </w:t>
-            </w:r>
-            <w:proofErr w:type="spellStart"/>
-            <w:r>
-              <w:t>ncrs</w:t>
-            </w:r>
-            <w:proofErr w:type="spellEnd"/>
-            <w:r>
-              <w:t xml:space="preserve"> from the table, along with a confirm message </w:t>
+              <w:t>cent ncrs table</w:t>
+            </w:r>
+            <w:r>
+              <w:t xml:space="preserve"> + edit ncrs from the table, along with a confirm message </w:t>
             </w:r>
             <w:r>
               <w:t>+ mobile view for the table (turned it into cards)</w:t>
@@ -887,15 +821,7 @@
               <w:t xml:space="preserve">Made a bunch of components (button, </w:t>
             </w:r>
             <w:r>
-              <w:t xml:space="preserve">inputs, new </w:t>
-            </w:r>
-            <w:proofErr w:type="spellStart"/>
-            <w:r>
-              <w:t>ncr</w:t>
-            </w:r>
-            <w:proofErr w:type="spellEnd"/>
-            <w:r>
-              <w:t xml:space="preserve"> form, …)</w:t>
+              <w:t>inputs, new ncr form, …)</w:t>
             </w:r>
           </w:p>
           <w:p>
@@ -958,13 +884,8 @@
               <w:t>Registered and set up domain</w:t>
             </w:r>
             <w:r>
-              <w:t xml:space="preserve"> and </w:t>
-            </w:r>
-            <w:proofErr w:type="spellStart"/>
-            <w:r>
-              <w:t>dns</w:t>
-            </w:r>
-            <w:proofErr w:type="spellEnd"/>
+              <w:t xml:space="preserve"> and dns</w:t>
+            </w:r>
           </w:p>
           <w:p>
             <w:pPr>
@@ -979,15 +900,7 @@
             </w:r>
             <w:r>
               <w:lastRenderedPageBreak/>
-              <w:t xml:space="preserve">database </w:t>
-            </w:r>
-            <w:proofErr w:type="spellStart"/>
-            <w:r>
-              <w:t>api</w:t>
-            </w:r>
-            <w:proofErr w:type="spellEnd"/>
-            <w:r>
-              <w:t xml:space="preserve"> calls</w:t>
+              <w:t>database api calls</w:t>
             </w:r>
           </w:p>
           <w:p>
@@ -1038,15 +951,7 @@
               </w:numPr>
             </w:pPr>
             <w:r>
-              <w:t xml:space="preserve">Guided team in </w:t>
-            </w:r>
-            <w:proofErr w:type="spellStart"/>
-            <w:r>
-              <w:t>github</w:t>
-            </w:r>
-            <w:proofErr w:type="spellEnd"/>
-            <w:r>
-              <w:t xml:space="preserve"> activities</w:t>
+              <w:t>Guided team in github activities</w:t>
             </w:r>
           </w:p>
           <w:p>
@@ -1058,15 +963,7 @@
               </w:numPr>
             </w:pPr>
             <w:r>
-              <w:t xml:space="preserve">Set up </w:t>
-            </w:r>
-            <w:proofErr w:type="spellStart"/>
-            <w:r>
-              <w:t>github</w:t>
-            </w:r>
-            <w:proofErr w:type="spellEnd"/>
-            <w:r>
-              <w:t xml:space="preserve"> project</w:t>
+              <w:t>Set up github project</w:t>
             </w:r>
           </w:p>
           <w:p>
@@ -1127,6 +1024,111 @@
             </w:pPr>
             <w:r>
               <w:t>Chase people for their work and contributions</w:t>
+            </w:r>
+          </w:p>
+          <w:p>
+            <w:pPr>
+              <w:pStyle w:val="ListParagraph"/>
+              <w:numPr>
+                <w:ilvl w:val="0"/>
+                <w:numId w:val="3"/>
+              </w:numPr>
+            </w:pPr>
+            <w:r>
+              <w:t xml:space="preserve">Encourage team mates to step up and </w:t>
+            </w:r>
+            <w:r>
+              <w:t>provide their best work</w:t>
+            </w:r>
+          </w:p>
+          <w:p>
+            <w:pPr>
+              <w:pStyle w:val="ListParagraph"/>
+              <w:numPr>
+                <w:ilvl w:val="0"/>
+                <w:numId w:val="3"/>
+              </w:numPr>
+            </w:pPr>
+            <w:r>
+              <w:t>Oversee completed code to ensure compatibility with other existing features and future plans</w:t>
+            </w:r>
+          </w:p>
+          <w:p>
+            <w:pPr>
+              <w:pStyle w:val="ListParagraph"/>
+              <w:numPr>
+                <w:ilvl w:val="0"/>
+                <w:numId w:val="3"/>
+              </w:numPr>
+            </w:pPr>
+            <w:r>
+              <w:t>Troubleshoot broken code</w:t>
+            </w:r>
+          </w:p>
+          <w:p>
+            <w:pPr>
+              <w:pStyle w:val="ListParagraph"/>
+              <w:numPr>
+                <w:ilvl w:val="0"/>
+                <w:numId w:val="3"/>
+              </w:numPr>
+            </w:pPr>
+            <w:r>
+              <w:t>Fix broken code</w:t>
+            </w:r>
+          </w:p>
+          <w:p>
+            <w:pPr>
+              <w:pStyle w:val="ListParagraph"/>
+              <w:numPr>
+                <w:ilvl w:val="0"/>
+                <w:numId w:val="3"/>
+              </w:numPr>
+            </w:pPr>
+            <w:r>
+              <w:t>Solve merge conflicts</w:t>
+            </w:r>
+          </w:p>
+          <w:p>
+            <w:pPr>
+              <w:pStyle w:val="ListParagraph"/>
+              <w:numPr>
+                <w:ilvl w:val="0"/>
+                <w:numId w:val="3"/>
+              </w:numPr>
+            </w:pPr>
+            <w:r>
+              <w:t>Manage branches</w:t>
+            </w:r>
+          </w:p>
+          <w:p>
+            <w:pPr>
+              <w:pStyle w:val="ListParagraph"/>
+              <w:numPr>
+                <w:ilvl w:val="0"/>
+                <w:numId w:val="3"/>
+              </w:numPr>
+            </w:pPr>
+            <w:r>
+              <w:t>Plan meetings for prep</w:t>
+            </w:r>
+          </w:p>
+          <w:p>
+            <w:pPr>
+              <w:pStyle w:val="ListParagraph"/>
+              <w:numPr>
+                <w:ilvl w:val="0"/>
+                <w:numId w:val="3"/>
+              </w:numPr>
+            </w:pPr>
+            <w:r>
+              <w:t xml:space="preserve">Provide answers </w:t>
+            </w:r>
+            <w:r>
+              <w:t xml:space="preserve">for frequently asked questions and </w:t>
+            </w:r>
+            <w:r>
+              <w:t>client related questions</w:t>
             </w:r>
           </w:p>
         </w:tc>
@@ -1146,7 +1148,7 @@
 </file>
 
 <file path=word/endnotes.xml><?xml version="1.0" encoding="utf-8"?>
-<w:endnotes xmlns:wpc="http://schemas.microsoft.com/office/word/2010/wordprocessingCanvas" xmlns:cx="http://schemas.microsoft.com/office/drawing/2014/chartex" xmlns:cx1="http://schemas.microsoft.com/office/drawing/2015/9/8/chartex" xmlns:cx2="http://schemas.microsoft.com/office/drawing/2015/10/21/chartex" xmlns:cx3="http://schemas.microsoft.com/office/drawing/2016/5/9/chartex" xmlns:cx4="http://schemas.microsoft.com/office/drawing/2016/5/10/chartex" xmlns:cx5="http://schemas.microsoft.com/office/drawing/2016/5/11/chartex" xmlns:cx6="http://schemas.microsoft.com/office/drawing/2016/5/12/chartex" xmlns:cx7="http://schemas.microsoft.com/office/drawing/2016/5/13/chartex" xmlns:cx8="http://schemas.microsoft.com/office/drawing/2016/5/14/chartex" xmlns:mc="http://schemas.openxmlformats.org/markup-compatibility/2006" xmlns:m="http://schemas.openxmlformats.org/officeDocument/2006/math" xmlns:aink="http://schemas.microsoft.com/office/drawing/2016/ink" xmlns:am3d="http://schemas.microsoft.com/office/drawing/2017/model3d" xmlns:oel="http://schemas.microsoft.com/office/2019/extlst" xmlns:r="http://schemas.openxmlformats.org/officeDocument/2006/relationships" xmlns:wp14="http://schemas.microsoft.com/office/word/2010/wordprocessingDrawing" xmlns:wp="http://schemas.openxmlformats.org/drawingml/2006/wordprocessingDrawing" xmlns:wpg="http://schemas.microsoft.com/office/word/2010/wordprocessingGroup" xmlns:wpi="http://schemas.microsoft.com/office/word/2010/wordprocessingInk" xmlns:wps="http://schemas.microsoft.com/office/word/2010/wordprocessingShape" xmlns:o="urn:schemas-microsoft-com:office:office" xmlns:v="urn:schemas-microsoft-com:vml" xmlns:w10="urn:schemas-microsoft-com:office:word" xmlns:w="http://schemas.openxmlformats.org/wordprocessingml/2006/main" xmlns:w14="http://schemas.microsoft.com/office/word/2010/wordml" xmlns:w15="http://schemas.microsoft.com/office/word/2012/wordml" xmlns:w16cex="http://schemas.microsoft.com/office/word/2018/wordml/cex" xmlns:w16cid="http://schemas.microsoft.com/office/word/2016/wordml/cid" xmlns:w16="http://schemas.microsoft.com/office/word/2018/wordml" xmlns:w16sdtdh="http://schemas.microsoft.com/office/word/2020/wordml/sdtdatahash" xmlns:w16sdtfl="http://schemas.microsoft.com/office/word/2024/wordml/sdtformatlock" xmlns:w16se="http://schemas.microsoft.com/office/word/2015/wordml/symex" xmlns:w16du="http://schemas.microsoft.com/office/word/2023/wordml/word16du" xmlns:wne="http://schemas.microsoft.com/office/word/2006/wordml" mc:Ignorable="w14 w15 w16se w16cid w16 w16cex w16sdtdh w16sdtfl w16du wp14">
+<w:endnotes xmlns:wpc="http://schemas.microsoft.com/office/word/2010/wordprocessingCanvas" xmlns:cx="http://schemas.microsoft.com/office/drawing/2014/chartex" xmlns:cx1="http://schemas.microsoft.com/office/drawing/2015/9/8/chartex" xmlns:cx2="http://schemas.microsoft.com/office/drawing/2015/10/21/chartex" xmlns:cx3="http://schemas.microsoft.com/office/drawing/2016/5/9/chartex" xmlns:cx4="http://schemas.microsoft.com/office/drawing/2016/5/10/chartex" xmlns:cx5="http://schemas.microsoft.com/office/drawing/2016/5/11/chartex" xmlns:cx6="http://schemas.microsoft.com/office/drawing/2016/5/12/chartex" xmlns:cx7="http://schemas.microsoft.com/office/drawing/2016/5/13/chartex" xmlns:cx8="http://schemas.microsoft.com/office/drawing/2016/5/14/chartex" xmlns:mc="http://schemas.openxmlformats.org/markup-compatibility/2006" xmlns:aink="http://schemas.microsoft.com/office/drawing/2016/ink" xmlns:am3d="http://schemas.microsoft.com/office/drawing/2017/model3d" xmlns:o="urn:schemas-microsoft-com:office:office" xmlns:oel="http://schemas.microsoft.com/office/2019/extlst" xmlns:r="http://schemas.openxmlformats.org/officeDocument/2006/relationships" xmlns:m="http://schemas.openxmlformats.org/officeDocument/2006/math" xmlns:v="urn:schemas-microsoft-com:vml" xmlns:wp14="http://schemas.microsoft.com/office/word/2010/wordprocessingDrawing" xmlns:wp="http://schemas.openxmlformats.org/drawingml/2006/wordprocessingDrawing" xmlns:w10="urn:schemas-microsoft-com:office:word" xmlns:w="http://schemas.openxmlformats.org/wordprocessingml/2006/main" xmlns:w14="http://schemas.microsoft.com/office/word/2010/wordml" xmlns:w15="http://schemas.microsoft.com/office/word/2012/wordml" xmlns:w16cex="http://schemas.microsoft.com/office/word/2018/wordml/cex" xmlns:w16cid="http://schemas.microsoft.com/office/word/2016/wordml/cid" xmlns:w16="http://schemas.microsoft.com/office/word/2018/wordml" xmlns:w16du="http://schemas.microsoft.com/office/word/2023/wordml/word16du" xmlns:w16sdtdh="http://schemas.microsoft.com/office/word/2020/wordml/sdtdatahash" xmlns:w16sdtfl="http://schemas.microsoft.com/office/word/2024/wordml/sdtformatlock" xmlns:w16se="http://schemas.microsoft.com/office/word/2015/wordml/symex" xmlns:wpg="http://schemas.microsoft.com/office/word/2010/wordprocessingGroup" xmlns:wpi="http://schemas.microsoft.com/office/word/2010/wordprocessingInk" xmlns:wne="http://schemas.microsoft.com/office/word/2006/wordml" xmlns:wps="http://schemas.microsoft.com/office/word/2010/wordprocessingShape" mc:Ignorable="w14 w15 w16se w16cid w16 w16cex w16sdtdh w16sdtfl w16du wp14">
   <w:endnote w:type="separator" w:id="-1">
     <w:p>
       <w:pPr>
@@ -1171,7 +1173,7 @@
 </file>
 
 <file path=word/footnotes.xml><?xml version="1.0" encoding="utf-8"?>
-<w:footnotes xmlns:wpc="http://schemas.microsoft.com/office/word/2010/wordprocessingCanvas" xmlns:cx="http://schemas.microsoft.com/office/drawing/2014/chartex" xmlns:cx1="http://schemas.microsoft.com/office/drawing/2015/9/8/chartex" xmlns:cx2="http://schemas.microsoft.com/office/drawing/2015/10/21/chartex" xmlns:cx3="http://schemas.microsoft.com/office/drawing/2016/5/9/chartex" xmlns:cx4="http://schemas.microsoft.com/office/drawing/2016/5/10/chartex" xmlns:cx5="http://schemas.microsoft.com/office/drawing/2016/5/11/chartex" xmlns:cx6="http://schemas.microsoft.com/office/drawing/2016/5/12/chartex" xmlns:cx7="http://schemas.microsoft.com/office/drawing/2016/5/13/chartex" xmlns:cx8="http://schemas.microsoft.com/office/drawing/2016/5/14/chartex" xmlns:mc="http://schemas.openxmlformats.org/markup-compatibility/2006" xmlns:m="http://schemas.openxmlformats.org/officeDocument/2006/math" xmlns:aink="http://schemas.microsoft.com/office/drawing/2016/ink" xmlns:am3d="http://schemas.microsoft.com/office/drawing/2017/model3d" xmlns:oel="http://schemas.microsoft.com/office/2019/extlst" xmlns:r="http://schemas.openxmlformats.org/officeDocument/2006/relationships" xmlns:wp14="http://schemas.microsoft.com/office/word/2010/wordprocessingDrawing" xmlns:wp="http://schemas.openxmlformats.org/drawingml/2006/wordprocessingDrawing" xmlns:wpg="http://schemas.microsoft.com/office/word/2010/wordprocessingGroup" xmlns:wpi="http://schemas.microsoft.com/office/word/2010/wordprocessingInk" xmlns:wps="http://schemas.microsoft.com/office/word/2010/wordprocessingShape" xmlns:o="urn:schemas-microsoft-com:office:office" xmlns:v="urn:schemas-microsoft-com:vml" xmlns:w10="urn:schemas-microsoft-com:office:word" xmlns:w="http://schemas.openxmlformats.org/wordprocessingml/2006/main" xmlns:w14="http://schemas.microsoft.com/office/word/2010/wordml" xmlns:w15="http://schemas.microsoft.com/office/word/2012/wordml" xmlns:w16cex="http://schemas.microsoft.com/office/word/2018/wordml/cex" xmlns:w16cid="http://schemas.microsoft.com/office/word/2016/wordml/cid" xmlns:w16="http://schemas.microsoft.com/office/word/2018/wordml" xmlns:w16sdtdh="http://schemas.microsoft.com/office/word/2020/wordml/sdtdatahash" xmlns:w16sdtfl="http://schemas.microsoft.com/office/word/2024/wordml/sdtformatlock" xmlns:w16se="http://schemas.microsoft.com/office/word/2015/wordml/symex" xmlns:w16du="http://schemas.microsoft.com/office/word/2023/wordml/word16du" xmlns:wne="http://schemas.microsoft.com/office/word/2006/wordml" mc:Ignorable="w14 w15 w16se w16cid w16 w16cex w16sdtdh w16sdtfl w16du wp14">
+<w:footnotes xmlns:wpc="http://schemas.microsoft.com/office/word/2010/wordprocessingCanvas" xmlns:cx="http://schemas.microsoft.com/office/drawing/2014/chartex" xmlns:cx1="http://schemas.microsoft.com/office/drawing/2015/9/8/chartex" xmlns:cx2="http://schemas.microsoft.com/office/drawing/2015/10/21/chartex" xmlns:cx3="http://schemas.microsoft.com/office/drawing/2016/5/9/chartex" xmlns:cx4="http://schemas.microsoft.com/office/drawing/2016/5/10/chartex" xmlns:cx5="http://schemas.microsoft.com/office/drawing/2016/5/11/chartex" xmlns:cx6="http://schemas.microsoft.com/office/drawing/2016/5/12/chartex" xmlns:cx7="http://schemas.microsoft.com/office/drawing/2016/5/13/chartex" xmlns:cx8="http://schemas.microsoft.com/office/drawing/2016/5/14/chartex" xmlns:mc="http://schemas.openxmlformats.org/markup-compatibility/2006" xmlns:aink="http://schemas.microsoft.com/office/drawing/2016/ink" xmlns:am3d="http://schemas.microsoft.com/office/drawing/2017/model3d" xmlns:o="urn:schemas-microsoft-com:office:office" xmlns:oel="http://schemas.microsoft.com/office/2019/extlst" xmlns:r="http://schemas.openxmlformats.org/officeDocument/2006/relationships" xmlns:m="http://schemas.openxmlformats.org/officeDocument/2006/math" xmlns:v="urn:schemas-microsoft-com:vml" xmlns:wp14="http://schemas.microsoft.com/office/word/2010/wordprocessingDrawing" xmlns:wp="http://schemas.openxmlformats.org/drawingml/2006/wordprocessingDrawing" xmlns:w10="urn:schemas-microsoft-com:office:word" xmlns:w="http://schemas.openxmlformats.org/wordprocessingml/2006/main" xmlns:w14="http://schemas.microsoft.com/office/word/2010/wordml" xmlns:w15="http://schemas.microsoft.com/office/word/2012/wordml" xmlns:w16cex="http://schemas.microsoft.com/office/word/2018/wordml/cex" xmlns:w16cid="http://schemas.microsoft.com/office/word/2016/wordml/cid" xmlns:w16="http://schemas.microsoft.com/office/word/2018/wordml" xmlns:w16du="http://schemas.microsoft.com/office/word/2023/wordml/word16du" xmlns:w16sdtdh="http://schemas.microsoft.com/office/word/2020/wordml/sdtdatahash" xmlns:w16sdtfl="http://schemas.microsoft.com/office/word/2024/wordml/sdtformatlock" xmlns:w16se="http://schemas.microsoft.com/office/word/2015/wordml/symex" xmlns:wpg="http://schemas.microsoft.com/office/word/2010/wordprocessingGroup" xmlns:wpi="http://schemas.microsoft.com/office/word/2010/wordprocessingInk" xmlns:wne="http://schemas.microsoft.com/office/word/2006/wordml" xmlns:wps="http://schemas.microsoft.com/office/word/2010/wordprocessingShape" mc:Ignorable="w14 w15 w16se w16cid w16 w16cex w16sdtdh w16sdtfl w16du wp14">
   <w:footnote w:type="separator" w:id="-1">
     <w:p>
       <w:pPr>
@@ -1196,7 +1198,7 @@
 </file>
 
 <file path=word/header1.xml><?xml version="1.0" encoding="utf-8"?>
-<w:hdr xmlns:wpc="http://schemas.microsoft.com/office/word/2010/wordprocessingCanvas" xmlns:cx="http://schemas.microsoft.com/office/drawing/2014/chartex" xmlns:cx1="http://schemas.microsoft.com/office/drawing/2015/9/8/chartex" xmlns:cx2="http://schemas.microsoft.com/office/drawing/2015/10/21/chartex" xmlns:cx3="http://schemas.microsoft.com/office/drawing/2016/5/9/chartex" xmlns:cx4="http://schemas.microsoft.com/office/drawing/2016/5/10/chartex" xmlns:cx5="http://schemas.microsoft.com/office/drawing/2016/5/11/chartex" xmlns:cx6="http://schemas.microsoft.com/office/drawing/2016/5/12/chartex" xmlns:cx7="http://schemas.microsoft.com/office/drawing/2016/5/13/chartex" xmlns:cx8="http://schemas.microsoft.com/office/drawing/2016/5/14/chartex" xmlns:mc="http://schemas.openxmlformats.org/markup-compatibility/2006" xmlns:m="http://schemas.openxmlformats.org/officeDocument/2006/math" xmlns:aink="http://schemas.microsoft.com/office/drawing/2016/ink" xmlns:am3d="http://schemas.microsoft.com/office/drawing/2017/model3d" xmlns:oel="http://schemas.microsoft.com/office/2019/extlst" xmlns:r="http://schemas.openxmlformats.org/officeDocument/2006/relationships" xmlns:wp14="http://schemas.microsoft.com/office/word/2010/wordprocessingDrawing" xmlns:wp="http://schemas.openxmlformats.org/drawingml/2006/wordprocessingDrawing" xmlns:wpg="http://schemas.microsoft.com/office/word/2010/wordprocessingGroup" xmlns:wpi="http://schemas.microsoft.com/office/word/2010/wordprocessingInk" xmlns:wps="http://schemas.microsoft.com/office/word/2010/wordprocessingShape" xmlns:o="urn:schemas-microsoft-com:office:office" xmlns:v="urn:schemas-microsoft-com:vml" xmlns:w10="urn:schemas-microsoft-com:office:word" xmlns:w="http://schemas.openxmlformats.org/wordprocessingml/2006/main" xmlns:w14="http://schemas.microsoft.com/office/word/2010/wordml" xmlns:w15="http://schemas.microsoft.com/office/word/2012/wordml" xmlns:w16cex="http://schemas.microsoft.com/office/word/2018/wordml/cex" xmlns:w16cid="http://schemas.microsoft.com/office/word/2016/wordml/cid" xmlns:w16="http://schemas.microsoft.com/office/word/2018/wordml" xmlns:w16sdtdh="http://schemas.microsoft.com/office/word/2020/wordml/sdtdatahash" xmlns:w16sdtfl="http://schemas.microsoft.com/office/word/2024/wordml/sdtformatlock" xmlns:w16se="http://schemas.microsoft.com/office/word/2015/wordml/symex" xmlns:w16du="http://schemas.microsoft.com/office/word/2023/wordml/word16du" xmlns:wne="http://schemas.microsoft.com/office/word/2006/wordml" mc:Ignorable="w14 w15 w16se w16cid w16 w16cex w16sdtdh w16sdtfl w16du wp14">
+<w:hdr xmlns:wpc="http://schemas.microsoft.com/office/word/2010/wordprocessingCanvas" xmlns:cx="http://schemas.microsoft.com/office/drawing/2014/chartex" xmlns:cx1="http://schemas.microsoft.com/office/drawing/2015/9/8/chartex" xmlns:cx2="http://schemas.microsoft.com/office/drawing/2015/10/21/chartex" xmlns:cx3="http://schemas.microsoft.com/office/drawing/2016/5/9/chartex" xmlns:cx4="http://schemas.microsoft.com/office/drawing/2016/5/10/chartex" xmlns:cx5="http://schemas.microsoft.com/office/drawing/2016/5/11/chartex" xmlns:cx6="http://schemas.microsoft.com/office/drawing/2016/5/12/chartex" xmlns:cx7="http://schemas.microsoft.com/office/drawing/2016/5/13/chartex" xmlns:cx8="http://schemas.microsoft.com/office/drawing/2016/5/14/chartex" xmlns:mc="http://schemas.openxmlformats.org/markup-compatibility/2006" xmlns:aink="http://schemas.microsoft.com/office/drawing/2016/ink" xmlns:am3d="http://schemas.microsoft.com/office/drawing/2017/model3d" xmlns:o="urn:schemas-microsoft-com:office:office" xmlns:oel="http://schemas.microsoft.com/office/2019/extlst" xmlns:r="http://schemas.openxmlformats.org/officeDocument/2006/relationships" xmlns:m="http://schemas.openxmlformats.org/officeDocument/2006/math" xmlns:v="urn:schemas-microsoft-com:vml" xmlns:wp14="http://schemas.microsoft.com/office/word/2010/wordprocessingDrawing" xmlns:wp="http://schemas.openxmlformats.org/drawingml/2006/wordprocessingDrawing" xmlns:w10="urn:schemas-microsoft-com:office:word" xmlns:w="http://schemas.openxmlformats.org/wordprocessingml/2006/main" xmlns:w14="http://schemas.microsoft.com/office/word/2010/wordml" xmlns:w15="http://schemas.microsoft.com/office/word/2012/wordml" xmlns:w16cex="http://schemas.microsoft.com/office/word/2018/wordml/cex" xmlns:w16cid="http://schemas.microsoft.com/office/word/2016/wordml/cid" xmlns:w16="http://schemas.microsoft.com/office/word/2018/wordml" xmlns:w16du="http://schemas.microsoft.com/office/word/2023/wordml/word16du" xmlns:w16sdtdh="http://schemas.microsoft.com/office/word/2020/wordml/sdtdatahash" xmlns:w16sdtfl="http://schemas.microsoft.com/office/word/2024/wordml/sdtformatlock" xmlns:w16se="http://schemas.microsoft.com/office/word/2015/wordml/symex" xmlns:wpg="http://schemas.microsoft.com/office/word/2010/wordprocessingGroup" xmlns:wpi="http://schemas.microsoft.com/office/word/2010/wordprocessingInk" xmlns:wne="http://schemas.microsoft.com/office/word/2006/wordml" xmlns:wps="http://schemas.microsoft.com/office/word/2010/wordprocessingShape" mc:Ignorable="w14 w15 w16se w16cid w16 w16cex w16sdtdh w16sdtfl w16du wp14">
   <w:p>
     <w:pPr>
       <w:pStyle w:val="Header"/>
@@ -1229,7 +1231,7 @@
 </file>
 
 <file path=word/numbering.xml><?xml version="1.0" encoding="utf-8"?>
-<w:numbering xmlns:wpc="http://schemas.microsoft.com/office/word/2010/wordprocessingCanvas" xmlns:cx="http://schemas.microsoft.com/office/drawing/2014/chartex" xmlns:cx1="http://schemas.microsoft.com/office/drawing/2015/9/8/chartex" xmlns:cx2="http://schemas.microsoft.com/office/drawing/2015/10/21/chartex" xmlns:cx3="http://schemas.microsoft.com/office/drawing/2016/5/9/chartex" xmlns:cx4="http://schemas.microsoft.com/office/drawing/2016/5/10/chartex" xmlns:cx5="http://schemas.microsoft.com/office/drawing/2016/5/11/chartex" xmlns:cx6="http://schemas.microsoft.com/office/drawing/2016/5/12/chartex" xmlns:cx7="http://schemas.microsoft.com/office/drawing/2016/5/13/chartex" xmlns:cx8="http://schemas.microsoft.com/office/drawing/2016/5/14/chartex" xmlns:mc="http://schemas.openxmlformats.org/markup-compatibility/2006" xmlns:m="http://schemas.openxmlformats.org/officeDocument/2006/math" xmlns:aink="http://schemas.microsoft.com/office/drawing/2016/ink" xmlns:am3d="http://schemas.microsoft.com/office/drawing/2017/model3d" xmlns:oel="http://schemas.microsoft.com/office/2019/extlst" xmlns:r="http://schemas.openxmlformats.org/officeDocument/2006/relationships" xmlns:wp14="http://schemas.microsoft.com/office/word/2010/wordprocessingDrawing" xmlns:wp="http://schemas.openxmlformats.org/drawingml/2006/wordprocessingDrawing" xmlns:wpg="http://schemas.microsoft.com/office/word/2010/wordprocessingGroup" xmlns:wpi="http://schemas.microsoft.com/office/word/2010/wordprocessingInk" xmlns:wps="http://schemas.microsoft.com/office/word/2010/wordprocessingShape" xmlns:o="urn:schemas-microsoft-com:office:office" xmlns:v="urn:schemas-microsoft-com:vml" xmlns:w10="urn:schemas-microsoft-com:office:word" xmlns:w="http://schemas.openxmlformats.org/wordprocessingml/2006/main" xmlns:w14="http://schemas.microsoft.com/office/word/2010/wordml" xmlns:w15="http://schemas.microsoft.com/office/word/2012/wordml" xmlns:w16cex="http://schemas.microsoft.com/office/word/2018/wordml/cex" xmlns:w16cid="http://schemas.microsoft.com/office/word/2016/wordml/cid" xmlns:w16="http://schemas.microsoft.com/office/word/2018/wordml" xmlns:w16sdtdh="http://schemas.microsoft.com/office/word/2020/wordml/sdtdatahash" xmlns:w16sdtfl="http://schemas.microsoft.com/office/word/2024/wordml/sdtformatlock" xmlns:w16se="http://schemas.microsoft.com/office/word/2015/wordml/symex" xmlns:w16du="http://schemas.microsoft.com/office/word/2023/wordml/word16du" xmlns:wne="http://schemas.microsoft.com/office/word/2006/wordml" mc:Ignorable="w14 w15 w16se w16cid w16 w16cex w16sdtdh w16sdtfl w16du wp14">
+<w:numbering xmlns:wpc="http://schemas.microsoft.com/office/word/2010/wordprocessingCanvas" xmlns:cx="http://schemas.microsoft.com/office/drawing/2014/chartex" xmlns:cx1="http://schemas.microsoft.com/office/drawing/2015/9/8/chartex" xmlns:cx2="http://schemas.microsoft.com/office/drawing/2015/10/21/chartex" xmlns:cx3="http://schemas.microsoft.com/office/drawing/2016/5/9/chartex" xmlns:cx4="http://schemas.microsoft.com/office/drawing/2016/5/10/chartex" xmlns:cx5="http://schemas.microsoft.com/office/drawing/2016/5/11/chartex" xmlns:cx6="http://schemas.microsoft.com/office/drawing/2016/5/12/chartex" xmlns:cx7="http://schemas.microsoft.com/office/drawing/2016/5/13/chartex" xmlns:cx8="http://schemas.microsoft.com/office/drawing/2016/5/14/chartex" xmlns:mc="http://schemas.openxmlformats.org/markup-compatibility/2006" xmlns:aink="http://schemas.microsoft.com/office/drawing/2016/ink" xmlns:am3d="http://schemas.microsoft.com/office/drawing/2017/model3d" xmlns:o="urn:schemas-microsoft-com:office:office" xmlns:oel="http://schemas.microsoft.com/office/2019/extlst" xmlns:r="http://schemas.openxmlformats.org/officeDocument/2006/relationships" xmlns:m="http://schemas.openxmlformats.org/officeDocument/2006/math" xmlns:v="urn:schemas-microsoft-com:vml" xmlns:wp14="http://schemas.microsoft.com/office/word/2010/wordprocessingDrawing" xmlns:wp="http://schemas.openxmlformats.org/drawingml/2006/wordprocessingDrawing" xmlns:w10="urn:schemas-microsoft-com:office:word" xmlns:w="http://schemas.openxmlformats.org/wordprocessingml/2006/main" xmlns:w14="http://schemas.microsoft.com/office/word/2010/wordml" xmlns:w15="http://schemas.microsoft.com/office/word/2012/wordml" xmlns:w16cex="http://schemas.microsoft.com/office/word/2018/wordml/cex" xmlns:w16cid="http://schemas.microsoft.com/office/word/2016/wordml/cid" xmlns:w16="http://schemas.microsoft.com/office/word/2018/wordml" xmlns:w16du="http://schemas.microsoft.com/office/word/2023/wordml/word16du" xmlns:w16sdtdh="http://schemas.microsoft.com/office/word/2020/wordml/sdtdatahash" xmlns:w16sdtfl="http://schemas.microsoft.com/office/word/2024/wordml/sdtformatlock" xmlns:w16se="http://schemas.microsoft.com/office/word/2015/wordml/symex" xmlns:wpg="http://schemas.microsoft.com/office/word/2010/wordprocessingGroup" xmlns:wpi="http://schemas.microsoft.com/office/word/2010/wordprocessingInk" xmlns:wne="http://schemas.microsoft.com/office/word/2006/wordml" xmlns:wps="http://schemas.microsoft.com/office/word/2010/wordprocessingShape" mc:Ignorable="w14 w15 w16se w16cid w16 w16cex w16sdtdh w16sdtfl w16du wp14">
   <w:abstractNum w:abstractNumId="0" w15:restartNumberingAfterBreak="0">
     <w:nsid w:val="04BA7C89"/>
     <w:multiLevelType w:val="hybridMultilevel"/>
@@ -2277,7 +2279,7 @@
 </file>
 
 <file path=word/styles.xml><?xml version="1.0" encoding="utf-8"?>
-<w:styles xmlns:mc="http://schemas.openxmlformats.org/markup-compatibility/2006" xmlns:r="http://schemas.openxmlformats.org/officeDocument/2006/relationships" xmlns:w="http://schemas.openxmlformats.org/wordprocessingml/2006/main" xmlns:w14="http://schemas.microsoft.com/office/word/2010/wordml" xmlns:w15="http://schemas.microsoft.com/office/word/2012/wordml" xmlns:w16cex="http://schemas.microsoft.com/office/word/2018/wordml/cex" xmlns:w16cid="http://schemas.microsoft.com/office/word/2016/wordml/cid" xmlns:w16="http://schemas.microsoft.com/office/word/2018/wordml" xmlns:w16sdtdh="http://schemas.microsoft.com/office/word/2020/wordml/sdtdatahash" xmlns:w16sdtfl="http://schemas.microsoft.com/office/word/2024/wordml/sdtformatlock" xmlns:w16se="http://schemas.microsoft.com/office/word/2015/wordml/symex" xmlns:w16du="http://schemas.microsoft.com/office/word/2023/wordml/word16du" mc:Ignorable="w14 w15 w16se w16cid w16 w16cex w16sdtdh w16sdtfl w16du">
+<w:styles xmlns:mc="http://schemas.openxmlformats.org/markup-compatibility/2006" xmlns:r="http://schemas.openxmlformats.org/officeDocument/2006/relationships" xmlns:w="http://schemas.openxmlformats.org/wordprocessingml/2006/main" xmlns:w14="http://schemas.microsoft.com/office/word/2010/wordml" xmlns:w15="http://schemas.microsoft.com/office/word/2012/wordml" xmlns:w16cex="http://schemas.microsoft.com/office/word/2018/wordml/cex" xmlns:w16cid="http://schemas.microsoft.com/office/word/2016/wordml/cid" xmlns:w16="http://schemas.microsoft.com/office/word/2018/wordml" xmlns:w16du="http://schemas.microsoft.com/office/word/2023/wordml/word16du" xmlns:w16sdtdh="http://schemas.microsoft.com/office/word/2020/wordml/sdtdatahash" xmlns:w16sdtfl="http://schemas.microsoft.com/office/word/2024/wordml/sdtformatlock" xmlns:w16se="http://schemas.microsoft.com/office/word/2015/wordml/symex" mc:Ignorable="w14 w15 w16se w16cid w16 w16cex w16sdtdh w16sdtfl w16du">
   <w:docDefaults>
     <w:rPrDefault>
       <w:rPr>

</xml_diff>

<commit_message>
Added my stuff to the completion document
title
</commit_message>
<xml_diff>
--- a/Non Code Items/Documents/F2024_IndividualTaskCompletion (P2) Updated.docx
+++ b/Non Code Items/Documents/F2024_IndividualTaskCompletion (P2) Updated.docx
@@ -1,6 +1,6 @@
 
 <file path=word/document.xml><?xml version="1.0" encoding="utf-8"?>
-<w:document xmlns:wpc="http://schemas.microsoft.com/office/word/2010/wordprocessingCanvas" xmlns:cx="http://schemas.microsoft.com/office/drawing/2014/chartex" xmlns:cx1="http://schemas.microsoft.com/office/drawing/2015/9/8/chartex" xmlns:cx2="http://schemas.microsoft.com/office/drawing/2015/10/21/chartex" xmlns:cx3="http://schemas.microsoft.com/office/drawing/2016/5/9/chartex" xmlns:cx4="http://schemas.microsoft.com/office/drawing/2016/5/10/chartex" xmlns:cx5="http://schemas.microsoft.com/office/drawing/2016/5/11/chartex" xmlns:cx6="http://schemas.microsoft.com/office/drawing/2016/5/12/chartex" xmlns:cx7="http://schemas.microsoft.com/office/drawing/2016/5/13/chartex" xmlns:cx8="http://schemas.microsoft.com/office/drawing/2016/5/14/chartex" xmlns:mc="http://schemas.openxmlformats.org/markup-compatibility/2006" xmlns:aink="http://schemas.microsoft.com/office/drawing/2016/ink" xmlns:am3d="http://schemas.microsoft.com/office/drawing/2017/model3d" xmlns:o="urn:schemas-microsoft-com:office:office" xmlns:oel="http://schemas.microsoft.com/office/2019/extlst" xmlns:r="http://schemas.openxmlformats.org/officeDocument/2006/relationships" xmlns:m="http://schemas.openxmlformats.org/officeDocument/2006/math" xmlns:v="urn:schemas-microsoft-com:vml" xmlns:wp14="http://schemas.microsoft.com/office/word/2010/wordprocessingDrawing" xmlns:wp="http://schemas.openxmlformats.org/drawingml/2006/wordprocessingDrawing" xmlns:w10="urn:schemas-microsoft-com:office:word" xmlns:w="http://schemas.openxmlformats.org/wordprocessingml/2006/main" xmlns:w14="http://schemas.microsoft.com/office/word/2010/wordml" xmlns:w15="http://schemas.microsoft.com/office/word/2012/wordml" xmlns:w16cex="http://schemas.microsoft.com/office/word/2018/wordml/cex" xmlns:w16cid="http://schemas.microsoft.com/office/word/2016/wordml/cid" xmlns:w16="http://schemas.microsoft.com/office/word/2018/wordml" xmlns:w16du="http://schemas.microsoft.com/office/word/2023/wordml/word16du" xmlns:w16sdtdh="http://schemas.microsoft.com/office/word/2020/wordml/sdtdatahash" xmlns:w16sdtfl="http://schemas.microsoft.com/office/word/2024/wordml/sdtformatlock" xmlns:w16se="http://schemas.microsoft.com/office/word/2015/wordml/symex" xmlns:wpg="http://schemas.microsoft.com/office/word/2010/wordprocessingGroup" xmlns:wpi="http://schemas.microsoft.com/office/word/2010/wordprocessingInk" xmlns:wne="http://schemas.microsoft.com/office/word/2006/wordml" xmlns:wps="http://schemas.microsoft.com/office/word/2010/wordprocessingShape" mc:Ignorable="w14 w15 w16se w16cid w16 w16cex w16sdtdh w16sdtfl w16du wp14">
+<w:document xmlns:wpc="http://schemas.microsoft.com/office/word/2010/wordprocessingCanvas" xmlns:mc="http://schemas.openxmlformats.org/markup-compatibility/2006" xmlns:o="urn:schemas-microsoft-com:office:office" xmlns:r="http://schemas.openxmlformats.org/officeDocument/2006/relationships" xmlns:m="http://schemas.openxmlformats.org/officeDocument/2006/math" xmlns:v="urn:schemas-microsoft-com:vml" xmlns:wp14="http://schemas.microsoft.com/office/word/2010/wordprocessingDrawing" xmlns:wp="http://schemas.openxmlformats.org/drawingml/2006/wordprocessingDrawing" xmlns:w10="urn:schemas-microsoft-com:office:word" xmlns:w="http://schemas.openxmlformats.org/wordprocessingml/2006/main" xmlns:w14="http://schemas.microsoft.com/office/word/2010/wordml" xmlns:wpg="http://schemas.microsoft.com/office/word/2010/wordprocessingGroup" xmlns:wpi="http://schemas.microsoft.com/office/word/2010/wordprocessingInk" xmlns:wne="http://schemas.microsoft.com/office/word/2006/wordml" xmlns:wps="http://schemas.microsoft.com/office/word/2010/wordprocessingShape" mc:Ignorable="w14 wp14">
   <w:body>
     <w:p>
       <w:pPr>
@@ -178,7 +178,15 @@
               </w:numPr>
             </w:pPr>
             <w:r>
-              <w:t xml:space="preserve">Updated the ERD in Lucidchart based on P1 presentation feedback. </w:t>
+              <w:t xml:space="preserve">Updated the ERD in </w:t>
+            </w:r>
+            <w:proofErr w:type="spellStart"/>
+            <w:r>
+              <w:t>Lucidchart</w:t>
+            </w:r>
+            <w:proofErr w:type="spellEnd"/>
+            <w:r>
+              <w:t xml:space="preserve"> based on P1 presentation feedback. </w:t>
             </w:r>
           </w:p>
           <w:p>
@@ -238,7 +246,15 @@
               </w:numPr>
             </w:pPr>
             <w:r>
-              <w:t xml:space="preserve">Collaborated with Edin on the experience map. </w:t>
+              <w:t xml:space="preserve">Collaborated with </w:t>
+            </w:r>
+            <w:proofErr w:type="spellStart"/>
+            <w:r>
+              <w:t>Edin</w:t>
+            </w:r>
+            <w:proofErr w:type="spellEnd"/>
+            <w:r>
+              <w:t xml:space="preserve"> on the experience map. </w:t>
             </w:r>
           </w:p>
           <w:p>
@@ -274,8 +290,13 @@
               </w:numPr>
             </w:pPr>
             <w:r>
-              <w:t>Established the database we would be using for our application with NocoDB</w:t>
-            </w:r>
+              <w:t xml:space="preserve">Established the database we would be using for our application with </w:t>
+            </w:r>
+            <w:proofErr w:type="spellStart"/>
+            <w:r>
+              <w:t>NocoDB</w:t>
+            </w:r>
+            <w:proofErr w:type="spellEnd"/>
           </w:p>
           <w:p>
             <w:pPr>
@@ -310,7 +331,15 @@
               </w:numPr>
             </w:pPr>
             <w:r>
-              <w:t xml:space="preserve">Personally, I had tasked myself with the issue of adding constraints to the database. It couldn’t have been done on NocoDB since you had to pay for it. I did it by adding another code file in the component’s folder. </w:t>
+              <w:t xml:space="preserve">Personally, I had tasked myself with the issue of adding constraints to the database. It couldn’t have been done on </w:t>
+            </w:r>
+            <w:proofErr w:type="spellStart"/>
+            <w:r>
+              <w:t>NocoDB</w:t>
+            </w:r>
+            <w:proofErr w:type="spellEnd"/>
+            <w:r>
+              <w:t xml:space="preserve"> since you had to pay for it. I did it by adding another code file in the component’s folder. </w:t>
             </w:r>
           </w:p>
           <w:p>
@@ -339,8 +368,13 @@
           <w:p>
             <w:r>
               <w:lastRenderedPageBreak/>
-              <w:t>Kayla Ogar</w:t>
-            </w:r>
+              <w:t xml:space="preserve">Kayla </w:t>
+            </w:r>
+            <w:proofErr w:type="spellStart"/>
+            <w:r>
+              <w:t>Ogar</w:t>
+            </w:r>
+            <w:proofErr w:type="spellEnd"/>
           </w:p>
         </w:tc>
         <w:tc>
@@ -349,7 +383,15 @@
           </w:tcPr>
           <w:p>
             <w:r>
-              <w:t>The project relies on mock data so the ncrs can’t be edited yet</w:t>
+              <w:t xml:space="preserve">The project relies on mock data so the </w:t>
+            </w:r>
+            <w:proofErr w:type="spellStart"/>
+            <w:r>
+              <w:t>ncrs</w:t>
+            </w:r>
+            <w:proofErr w:type="spellEnd"/>
+            <w:r>
+              <w:t xml:space="preserve"> can’t be edited yet</w:t>
             </w:r>
           </w:p>
         </w:tc>
@@ -478,8 +520,13 @@
             <w:tcW w:w="2949" w:type="dxa"/>
           </w:tcPr>
           <w:p>
-            <w:r>
-              <w:t xml:space="preserve">Edin </w:t>
+            <w:proofErr w:type="spellStart"/>
+            <w:r>
+              <w:t>Edin</w:t>
+            </w:r>
+            <w:proofErr w:type="spellEnd"/>
+            <w:r>
+              <w:t xml:space="preserve"> </w:t>
             </w:r>
           </w:p>
         </w:tc>
@@ -489,7 +536,27 @@
           </w:tcPr>
           <w:p>
             <w:r>
-              <w:t>-Test the website to make sure all of the pain points from the experience map were addressed.</w:t>
+              <w:t>-Test the website to make sure all of the pain points from th</w:t>
+            </w:r>
+            <w:r>
+              <w:t>e experience map were addressed</w:t>
+            </w:r>
+          </w:p>
+          <w:p>
+            <w:r>
+              <w:t>-Fix some issues with the UI</w:t>
+            </w:r>
+          </w:p>
+          <w:p>
+            <w:r>
+              <w:t>-Make sure everyone stops putting childish seed data into the database</w:t>
+            </w:r>
+            <w:bookmarkStart w:id="0" w:name="_GoBack"/>
+            <w:bookmarkEnd w:id="0"/>
+          </w:p>
+          <w:p>
+            <w:r>
+              <w:t>-Prepare for the upcoming presentation with the other team members</w:t>
             </w:r>
           </w:p>
         </w:tc>
@@ -499,6 +566,35 @@
           </w:tcPr>
           <w:p>
             <w:r>
+              <w:t>-Replaced all old seeded data with new seeded data that more accurately reflects a real NCR</w:t>
+            </w:r>
+          </w:p>
+          <w:p>
+            <w:r>
+              <w:t>-Tested the website with Steve to determine what needed to be changed for a better experience</w:t>
+            </w:r>
+          </w:p>
+          <w:p>
+            <w:r>
+              <w:t>-Simplified the NCR view to only include relevant information</w:t>
+            </w:r>
+          </w:p>
+          <w:p>
+            <w:r>
+              <w:t xml:space="preserve">-Fixed the NCR count box not displaying the number of closed NCRS (this box was later removed </w:t>
+            </w:r>
+            <w:r>
+              <w:lastRenderedPageBreak/>
+              <w:t>entirely)</w:t>
+            </w:r>
+          </w:p>
+          <w:p>
+            <w:r>
+              <w:t>-Improved the look of the NCR list on different sized screens</w:t>
+            </w:r>
+          </w:p>
+          <w:p>
+            <w:r>
               <w:t>-The experience map is completely finished</w:t>
             </w:r>
           </w:p>
@@ -524,11 +620,7 @@
           </w:p>
           <w:p>
             <w:r>
-              <w:t xml:space="preserve">-Pain points/problems with the </w:t>
-            </w:r>
-            <w:r>
-              <w:lastRenderedPageBreak/>
-              <w:t>current process</w:t>
+              <w:t>-Pain points/problems with the current process</w:t>
             </w:r>
           </w:p>
         </w:tc>
@@ -662,10 +754,26 @@
               <w:t>Programmed re</w:t>
             </w:r>
             <w:r>
-              <w:t>cent ncrs table</w:t>
-            </w:r>
-            <w:r>
-              <w:t xml:space="preserve"> + edit ncrs from the table, along with a confirm message </w:t>
+              <w:t xml:space="preserve">cent </w:t>
+            </w:r>
+            <w:proofErr w:type="spellStart"/>
+            <w:r>
+              <w:t>ncrs</w:t>
+            </w:r>
+            <w:proofErr w:type="spellEnd"/>
+            <w:r>
+              <w:t xml:space="preserve"> table</w:t>
+            </w:r>
+            <w:r>
+              <w:t xml:space="preserve"> + edit </w:t>
+            </w:r>
+            <w:proofErr w:type="spellStart"/>
+            <w:r>
+              <w:t>ncrs</w:t>
+            </w:r>
+            <w:proofErr w:type="spellEnd"/>
+            <w:r>
+              <w:t xml:space="preserve"> from the table, along with a confirm message </w:t>
             </w:r>
             <w:r>
               <w:t>+ mobile view for the table (turned it into cards)</w:t>
@@ -736,6 +844,7 @@
           </w:tcPr>
           <w:p>
             <w:r>
+              <w:lastRenderedPageBreak/>
               <w:t>Steve</w:t>
             </w:r>
           </w:p>
@@ -801,8 +910,13 @@
               </w:numPr>
             </w:pPr>
             <w:r>
-              <w:t>Add auth</w:t>
-            </w:r>
+              <w:t xml:space="preserve">Add </w:t>
+            </w:r>
+            <w:proofErr w:type="spellStart"/>
+            <w:r>
+              <w:t>auth</w:t>
+            </w:r>
+            <w:proofErr w:type="spellEnd"/>
           </w:p>
         </w:tc>
         <w:tc>
@@ -821,7 +935,15 @@
               <w:t xml:space="preserve">Made a bunch of components (button, </w:t>
             </w:r>
             <w:r>
-              <w:t>inputs, new ncr form, …)</w:t>
+              <w:t xml:space="preserve">inputs, new </w:t>
+            </w:r>
+            <w:proofErr w:type="spellStart"/>
+            <w:r>
+              <w:t>ncr</w:t>
+            </w:r>
+            <w:proofErr w:type="spellEnd"/>
+            <w:r>
+              <w:t xml:space="preserve"> form, …)</w:t>
             </w:r>
           </w:p>
           <w:p>
@@ -832,8 +954,13 @@
                 <w:numId w:val="3"/>
               </w:numPr>
             </w:pPr>
-            <w:r>
-              <w:t>Scaffolded entire web app</w:t>
+            <w:proofErr w:type="spellStart"/>
+            <w:r>
+              <w:t>Scaffolded</w:t>
+            </w:r>
+            <w:proofErr w:type="spellEnd"/>
+            <w:r>
+              <w:t xml:space="preserve"> entire web app</w:t>
             </w:r>
           </w:p>
           <w:p>
@@ -884,8 +1011,13 @@
               <w:t>Registered and set up domain</w:t>
             </w:r>
             <w:r>
-              <w:t xml:space="preserve"> and dns</w:t>
-            </w:r>
+              <w:t xml:space="preserve"> and </w:t>
+            </w:r>
+            <w:proofErr w:type="spellStart"/>
+            <w:r>
+              <w:t>dns</w:t>
+            </w:r>
+            <w:proofErr w:type="spellEnd"/>
           </w:p>
           <w:p>
             <w:pPr>
@@ -896,161 +1028,193 @@
               </w:numPr>
             </w:pPr>
             <w:r>
-              <w:t xml:space="preserve">Configured secrets management and proxied </w:t>
+              <w:t xml:space="preserve">Configured secrets management and </w:t>
+            </w:r>
+            <w:proofErr w:type="spellStart"/>
+            <w:r>
+              <w:t>proxied</w:t>
+            </w:r>
+            <w:proofErr w:type="spellEnd"/>
+            <w:r>
+              <w:t xml:space="preserve"> database </w:t>
+            </w:r>
+            <w:proofErr w:type="spellStart"/>
+            <w:r>
+              <w:t>api</w:t>
+            </w:r>
+            <w:proofErr w:type="spellEnd"/>
+            <w:r>
+              <w:t xml:space="preserve"> calls</w:t>
+            </w:r>
+          </w:p>
+          <w:p>
+            <w:pPr>
+              <w:pStyle w:val="ListParagraph"/>
+              <w:numPr>
+                <w:ilvl w:val="0"/>
+                <w:numId w:val="3"/>
+              </w:numPr>
+            </w:pPr>
+            <w:r>
+              <w:t xml:space="preserve">Built </w:t>
+            </w:r>
+            <w:r>
+              <w:t>a</w:t>
+            </w:r>
+            <w:r>
+              <w:t>rchive page and reports</w:t>
+            </w:r>
+            <w:r>
+              <w:t xml:space="preserve"> page</w:t>
+            </w:r>
+          </w:p>
+          <w:p>
+            <w:pPr>
+              <w:pStyle w:val="ListParagraph"/>
+              <w:numPr>
+                <w:ilvl w:val="0"/>
+                <w:numId w:val="3"/>
+              </w:numPr>
+            </w:pPr>
+            <w:r>
+              <w:t>Help build dashboard</w:t>
+            </w:r>
+            <w:r>
+              <w:t xml:space="preserve"> and NCR</w:t>
+            </w:r>
+            <w:r>
+              <w:t xml:space="preserve"> page</w:t>
+            </w:r>
+          </w:p>
+          <w:p>
+            <w:pPr>
+              <w:pStyle w:val="ListParagraph"/>
+              <w:numPr>
+                <w:ilvl w:val="0"/>
+                <w:numId w:val="3"/>
+              </w:numPr>
+            </w:pPr>
+            <w:r>
+              <w:t xml:space="preserve">Guided team in </w:t>
+            </w:r>
+            <w:proofErr w:type="spellStart"/>
+            <w:r>
+              <w:t>github</w:t>
+            </w:r>
+            <w:proofErr w:type="spellEnd"/>
+            <w:r>
+              <w:t xml:space="preserve"> activities</w:t>
+            </w:r>
+          </w:p>
+          <w:p>
+            <w:pPr>
+              <w:pStyle w:val="ListParagraph"/>
+              <w:numPr>
+                <w:ilvl w:val="0"/>
+                <w:numId w:val="3"/>
+              </w:numPr>
+            </w:pPr>
+            <w:r>
+              <w:t xml:space="preserve">Set up </w:t>
+            </w:r>
+            <w:proofErr w:type="spellStart"/>
+            <w:r>
+              <w:t>github</w:t>
+            </w:r>
+            <w:proofErr w:type="spellEnd"/>
+            <w:r>
+              <w:t xml:space="preserve"> project</w:t>
+            </w:r>
+          </w:p>
+          <w:p>
+            <w:pPr>
+              <w:pStyle w:val="ListParagraph"/>
+              <w:numPr>
+                <w:ilvl w:val="0"/>
+                <w:numId w:val="3"/>
+              </w:numPr>
+            </w:pPr>
+            <w:r>
+              <w:t>Set up issues</w:t>
+            </w:r>
+          </w:p>
+          <w:p>
+            <w:pPr>
+              <w:pStyle w:val="ListParagraph"/>
+              <w:numPr>
+                <w:ilvl w:val="0"/>
+                <w:numId w:val="3"/>
+              </w:numPr>
+            </w:pPr>
+            <w:r>
+              <w:t>Taught about branches and common git commands (merge, branch, pull, push, fetch, rebase, …)</w:t>
+            </w:r>
+          </w:p>
+          <w:p>
+            <w:pPr>
+              <w:pStyle w:val="ListParagraph"/>
+              <w:numPr>
+                <w:ilvl w:val="0"/>
+                <w:numId w:val="3"/>
+              </w:numPr>
+            </w:pPr>
+            <w:r>
+              <w:t>Verify colours are correct</w:t>
+            </w:r>
+          </w:p>
+          <w:p>
+            <w:pPr>
+              <w:pStyle w:val="ListParagraph"/>
+              <w:numPr>
+                <w:ilvl w:val="0"/>
+                <w:numId w:val="3"/>
+              </w:numPr>
+            </w:pPr>
+            <w:r>
+              <w:t>Ensure light/dark mode compatibility</w:t>
+            </w:r>
+          </w:p>
+          <w:p>
+            <w:pPr>
+              <w:pStyle w:val="ListParagraph"/>
+              <w:numPr>
+                <w:ilvl w:val="0"/>
+                <w:numId w:val="3"/>
+              </w:numPr>
+            </w:pPr>
+            <w:r>
+              <w:t>Chase people for their work and contributions</w:t>
+            </w:r>
+          </w:p>
+          <w:p>
+            <w:pPr>
+              <w:pStyle w:val="ListParagraph"/>
+              <w:numPr>
+                <w:ilvl w:val="0"/>
+                <w:numId w:val="3"/>
+              </w:numPr>
+            </w:pPr>
+            <w:r>
+              <w:t xml:space="preserve">Encourage team mates to step up and </w:t>
+            </w:r>
+            <w:r>
+              <w:t>provide their best work</w:t>
+            </w:r>
+          </w:p>
+          <w:p>
+            <w:pPr>
+              <w:pStyle w:val="ListParagraph"/>
+              <w:numPr>
+                <w:ilvl w:val="0"/>
+                <w:numId w:val="3"/>
+              </w:numPr>
+            </w:pPr>
+            <w:r>
+              <w:t xml:space="preserve">Oversee completed code to ensure compatibility with other existing features and </w:t>
             </w:r>
             <w:r>
               <w:lastRenderedPageBreak/>
-              <w:t>database api calls</w:t>
-            </w:r>
-          </w:p>
-          <w:p>
-            <w:pPr>
-              <w:pStyle w:val="ListParagraph"/>
-              <w:numPr>
-                <w:ilvl w:val="0"/>
-                <w:numId w:val="3"/>
-              </w:numPr>
-            </w:pPr>
-            <w:r>
-              <w:t xml:space="preserve">Built </w:t>
-            </w:r>
-            <w:r>
-              <w:t>a</w:t>
-            </w:r>
-            <w:r>
-              <w:t>rchive page and reports</w:t>
-            </w:r>
-            <w:r>
-              <w:t xml:space="preserve"> page</w:t>
-            </w:r>
-          </w:p>
-          <w:p>
-            <w:pPr>
-              <w:pStyle w:val="ListParagraph"/>
-              <w:numPr>
-                <w:ilvl w:val="0"/>
-                <w:numId w:val="3"/>
-              </w:numPr>
-            </w:pPr>
-            <w:r>
-              <w:t>Help build dashboard</w:t>
-            </w:r>
-            <w:r>
-              <w:t xml:space="preserve"> and NCR</w:t>
-            </w:r>
-            <w:r>
-              <w:t xml:space="preserve"> page</w:t>
-            </w:r>
-          </w:p>
-          <w:p>
-            <w:pPr>
-              <w:pStyle w:val="ListParagraph"/>
-              <w:numPr>
-                <w:ilvl w:val="0"/>
-                <w:numId w:val="3"/>
-              </w:numPr>
-            </w:pPr>
-            <w:r>
-              <w:t>Guided team in github activities</w:t>
-            </w:r>
-          </w:p>
-          <w:p>
-            <w:pPr>
-              <w:pStyle w:val="ListParagraph"/>
-              <w:numPr>
-                <w:ilvl w:val="0"/>
-                <w:numId w:val="3"/>
-              </w:numPr>
-            </w:pPr>
-            <w:r>
-              <w:t>Set up github project</w:t>
-            </w:r>
-          </w:p>
-          <w:p>
-            <w:pPr>
-              <w:pStyle w:val="ListParagraph"/>
-              <w:numPr>
-                <w:ilvl w:val="0"/>
-                <w:numId w:val="3"/>
-              </w:numPr>
-            </w:pPr>
-            <w:r>
-              <w:t>Set up issues</w:t>
-            </w:r>
-          </w:p>
-          <w:p>
-            <w:pPr>
-              <w:pStyle w:val="ListParagraph"/>
-              <w:numPr>
-                <w:ilvl w:val="0"/>
-                <w:numId w:val="3"/>
-              </w:numPr>
-            </w:pPr>
-            <w:r>
-              <w:t>Taught about branches and common git commands (merge, branch, pull, push, fetch, rebase, …)</w:t>
-            </w:r>
-          </w:p>
-          <w:p>
-            <w:pPr>
-              <w:pStyle w:val="ListParagraph"/>
-              <w:numPr>
-                <w:ilvl w:val="0"/>
-                <w:numId w:val="3"/>
-              </w:numPr>
-            </w:pPr>
-            <w:r>
-              <w:t>Verify colours are correct</w:t>
-            </w:r>
-          </w:p>
-          <w:p>
-            <w:pPr>
-              <w:pStyle w:val="ListParagraph"/>
-              <w:numPr>
-                <w:ilvl w:val="0"/>
-                <w:numId w:val="3"/>
-              </w:numPr>
-            </w:pPr>
-            <w:r>
-              <w:t>Ensure light/dark mode compatibility</w:t>
-            </w:r>
-          </w:p>
-          <w:p>
-            <w:pPr>
-              <w:pStyle w:val="ListParagraph"/>
-              <w:numPr>
-                <w:ilvl w:val="0"/>
-                <w:numId w:val="3"/>
-              </w:numPr>
-            </w:pPr>
-            <w:r>
-              <w:t>Chase people for their work and contributions</w:t>
-            </w:r>
-          </w:p>
-          <w:p>
-            <w:pPr>
-              <w:pStyle w:val="ListParagraph"/>
-              <w:numPr>
-                <w:ilvl w:val="0"/>
-                <w:numId w:val="3"/>
-              </w:numPr>
-            </w:pPr>
-            <w:r>
-              <w:t xml:space="preserve">Encourage team mates to step up and </w:t>
-            </w:r>
-            <w:r>
-              <w:t>provide their best work</w:t>
-            </w:r>
-          </w:p>
-          <w:p>
-            <w:pPr>
-              <w:pStyle w:val="ListParagraph"/>
-              <w:numPr>
-                <w:ilvl w:val="0"/>
-                <w:numId w:val="3"/>
-              </w:numPr>
-            </w:pPr>
-            <w:r>
-              <w:t>Oversee completed code to ensure compatibility with other existing features and future plans</w:t>
+              <w:t>future plans</w:t>
             </w:r>
           </w:p>
           <w:p>
@@ -1137,7 +1301,7 @@
     <w:p/>
     <w:p/>
     <w:sectPr>
-      <w:headerReference w:type="default" r:id="rId7"/>
+      <w:headerReference w:type="default" r:id="rId8"/>
       <w:pgSz w:w="12240" w:h="15840"/>
       <w:pgMar w:top="1440" w:right="1440" w:bottom="1440" w:left="1440" w:header="720" w:footer="720" w:gutter="0"/>
       <w:cols w:space="720"/>
@@ -1148,7 +1312,7 @@
 </file>
 
 <file path=word/endnotes.xml><?xml version="1.0" encoding="utf-8"?>
-<w:endnotes xmlns:wpc="http://schemas.microsoft.com/office/word/2010/wordprocessingCanvas" xmlns:cx="http://schemas.microsoft.com/office/drawing/2014/chartex" xmlns:cx1="http://schemas.microsoft.com/office/drawing/2015/9/8/chartex" xmlns:cx2="http://schemas.microsoft.com/office/drawing/2015/10/21/chartex" xmlns:cx3="http://schemas.microsoft.com/office/drawing/2016/5/9/chartex" xmlns:cx4="http://schemas.microsoft.com/office/drawing/2016/5/10/chartex" xmlns:cx5="http://schemas.microsoft.com/office/drawing/2016/5/11/chartex" xmlns:cx6="http://schemas.microsoft.com/office/drawing/2016/5/12/chartex" xmlns:cx7="http://schemas.microsoft.com/office/drawing/2016/5/13/chartex" xmlns:cx8="http://schemas.microsoft.com/office/drawing/2016/5/14/chartex" xmlns:mc="http://schemas.openxmlformats.org/markup-compatibility/2006" xmlns:aink="http://schemas.microsoft.com/office/drawing/2016/ink" xmlns:am3d="http://schemas.microsoft.com/office/drawing/2017/model3d" xmlns:o="urn:schemas-microsoft-com:office:office" xmlns:oel="http://schemas.microsoft.com/office/2019/extlst" xmlns:r="http://schemas.openxmlformats.org/officeDocument/2006/relationships" xmlns:m="http://schemas.openxmlformats.org/officeDocument/2006/math" xmlns:v="urn:schemas-microsoft-com:vml" xmlns:wp14="http://schemas.microsoft.com/office/word/2010/wordprocessingDrawing" xmlns:wp="http://schemas.openxmlformats.org/drawingml/2006/wordprocessingDrawing" xmlns:w10="urn:schemas-microsoft-com:office:word" xmlns:w="http://schemas.openxmlformats.org/wordprocessingml/2006/main" xmlns:w14="http://schemas.microsoft.com/office/word/2010/wordml" xmlns:w15="http://schemas.microsoft.com/office/word/2012/wordml" xmlns:w16cex="http://schemas.microsoft.com/office/word/2018/wordml/cex" xmlns:w16cid="http://schemas.microsoft.com/office/word/2016/wordml/cid" xmlns:w16="http://schemas.microsoft.com/office/word/2018/wordml" xmlns:w16du="http://schemas.microsoft.com/office/word/2023/wordml/word16du" xmlns:w16sdtdh="http://schemas.microsoft.com/office/word/2020/wordml/sdtdatahash" xmlns:w16sdtfl="http://schemas.microsoft.com/office/word/2024/wordml/sdtformatlock" xmlns:w16se="http://schemas.microsoft.com/office/word/2015/wordml/symex" xmlns:wpg="http://schemas.microsoft.com/office/word/2010/wordprocessingGroup" xmlns:wpi="http://schemas.microsoft.com/office/word/2010/wordprocessingInk" xmlns:wne="http://schemas.microsoft.com/office/word/2006/wordml" xmlns:wps="http://schemas.microsoft.com/office/word/2010/wordprocessingShape" mc:Ignorable="w14 w15 w16se w16cid w16 w16cex w16sdtdh w16sdtfl w16du wp14">
+<w:endnotes xmlns:wpc="http://schemas.microsoft.com/office/word/2010/wordprocessingCanvas" xmlns:mc="http://schemas.openxmlformats.org/markup-compatibility/2006" xmlns:o="urn:schemas-microsoft-com:office:office" xmlns:r="http://schemas.openxmlformats.org/officeDocument/2006/relationships" xmlns:m="http://schemas.openxmlformats.org/officeDocument/2006/math" xmlns:v="urn:schemas-microsoft-com:vml" xmlns:wp14="http://schemas.microsoft.com/office/word/2010/wordprocessingDrawing" xmlns:wp="http://schemas.openxmlformats.org/drawingml/2006/wordprocessingDrawing" xmlns:w10="urn:schemas-microsoft-com:office:word" xmlns:w="http://schemas.openxmlformats.org/wordprocessingml/2006/main" xmlns:w14="http://schemas.microsoft.com/office/word/2010/wordml" xmlns:wpg="http://schemas.microsoft.com/office/word/2010/wordprocessingGroup" xmlns:wpi="http://schemas.microsoft.com/office/word/2010/wordprocessingInk" xmlns:wne="http://schemas.microsoft.com/office/word/2006/wordml" xmlns:wps="http://schemas.microsoft.com/office/word/2010/wordprocessingShape" mc:Ignorable="w14 wp14">
   <w:endnote w:type="separator" w:id="-1">
     <w:p>
       <w:pPr>
@@ -1173,7 +1337,7 @@
 </file>
 
 <file path=word/footnotes.xml><?xml version="1.0" encoding="utf-8"?>
-<w:footnotes xmlns:wpc="http://schemas.microsoft.com/office/word/2010/wordprocessingCanvas" xmlns:cx="http://schemas.microsoft.com/office/drawing/2014/chartex" xmlns:cx1="http://schemas.microsoft.com/office/drawing/2015/9/8/chartex" xmlns:cx2="http://schemas.microsoft.com/office/drawing/2015/10/21/chartex" xmlns:cx3="http://schemas.microsoft.com/office/drawing/2016/5/9/chartex" xmlns:cx4="http://schemas.microsoft.com/office/drawing/2016/5/10/chartex" xmlns:cx5="http://schemas.microsoft.com/office/drawing/2016/5/11/chartex" xmlns:cx6="http://schemas.microsoft.com/office/drawing/2016/5/12/chartex" xmlns:cx7="http://schemas.microsoft.com/office/drawing/2016/5/13/chartex" xmlns:cx8="http://schemas.microsoft.com/office/drawing/2016/5/14/chartex" xmlns:mc="http://schemas.openxmlformats.org/markup-compatibility/2006" xmlns:aink="http://schemas.microsoft.com/office/drawing/2016/ink" xmlns:am3d="http://schemas.microsoft.com/office/drawing/2017/model3d" xmlns:o="urn:schemas-microsoft-com:office:office" xmlns:oel="http://schemas.microsoft.com/office/2019/extlst" xmlns:r="http://schemas.openxmlformats.org/officeDocument/2006/relationships" xmlns:m="http://schemas.openxmlformats.org/officeDocument/2006/math" xmlns:v="urn:schemas-microsoft-com:vml" xmlns:wp14="http://schemas.microsoft.com/office/word/2010/wordprocessingDrawing" xmlns:wp="http://schemas.openxmlformats.org/drawingml/2006/wordprocessingDrawing" xmlns:w10="urn:schemas-microsoft-com:office:word" xmlns:w="http://schemas.openxmlformats.org/wordprocessingml/2006/main" xmlns:w14="http://schemas.microsoft.com/office/word/2010/wordml" xmlns:w15="http://schemas.microsoft.com/office/word/2012/wordml" xmlns:w16cex="http://schemas.microsoft.com/office/word/2018/wordml/cex" xmlns:w16cid="http://schemas.microsoft.com/office/word/2016/wordml/cid" xmlns:w16="http://schemas.microsoft.com/office/word/2018/wordml" xmlns:w16du="http://schemas.microsoft.com/office/word/2023/wordml/word16du" xmlns:w16sdtdh="http://schemas.microsoft.com/office/word/2020/wordml/sdtdatahash" xmlns:w16sdtfl="http://schemas.microsoft.com/office/word/2024/wordml/sdtformatlock" xmlns:w16se="http://schemas.microsoft.com/office/word/2015/wordml/symex" xmlns:wpg="http://schemas.microsoft.com/office/word/2010/wordprocessingGroup" xmlns:wpi="http://schemas.microsoft.com/office/word/2010/wordprocessingInk" xmlns:wne="http://schemas.microsoft.com/office/word/2006/wordml" xmlns:wps="http://schemas.microsoft.com/office/word/2010/wordprocessingShape" mc:Ignorable="w14 w15 w16se w16cid w16 w16cex w16sdtdh w16sdtfl w16du wp14">
+<w:footnotes xmlns:wpc="http://schemas.microsoft.com/office/word/2010/wordprocessingCanvas" xmlns:mc="http://schemas.openxmlformats.org/markup-compatibility/2006" xmlns:o="urn:schemas-microsoft-com:office:office" xmlns:r="http://schemas.openxmlformats.org/officeDocument/2006/relationships" xmlns:m="http://schemas.openxmlformats.org/officeDocument/2006/math" xmlns:v="urn:schemas-microsoft-com:vml" xmlns:wp14="http://schemas.microsoft.com/office/word/2010/wordprocessingDrawing" xmlns:wp="http://schemas.openxmlformats.org/drawingml/2006/wordprocessingDrawing" xmlns:w10="urn:schemas-microsoft-com:office:word" xmlns:w="http://schemas.openxmlformats.org/wordprocessingml/2006/main" xmlns:w14="http://schemas.microsoft.com/office/word/2010/wordml" xmlns:wpg="http://schemas.microsoft.com/office/word/2010/wordprocessingGroup" xmlns:wpi="http://schemas.microsoft.com/office/word/2010/wordprocessingInk" xmlns:wne="http://schemas.microsoft.com/office/word/2006/wordml" xmlns:wps="http://schemas.microsoft.com/office/word/2010/wordprocessingShape" mc:Ignorable="w14 wp14">
   <w:footnote w:type="separator" w:id="-1">
     <w:p>
       <w:pPr>
@@ -1198,7 +1362,7 @@
 </file>
 
 <file path=word/header1.xml><?xml version="1.0" encoding="utf-8"?>
-<w:hdr xmlns:wpc="http://schemas.microsoft.com/office/word/2010/wordprocessingCanvas" xmlns:cx="http://schemas.microsoft.com/office/drawing/2014/chartex" xmlns:cx1="http://schemas.microsoft.com/office/drawing/2015/9/8/chartex" xmlns:cx2="http://schemas.microsoft.com/office/drawing/2015/10/21/chartex" xmlns:cx3="http://schemas.microsoft.com/office/drawing/2016/5/9/chartex" xmlns:cx4="http://schemas.microsoft.com/office/drawing/2016/5/10/chartex" xmlns:cx5="http://schemas.microsoft.com/office/drawing/2016/5/11/chartex" xmlns:cx6="http://schemas.microsoft.com/office/drawing/2016/5/12/chartex" xmlns:cx7="http://schemas.microsoft.com/office/drawing/2016/5/13/chartex" xmlns:cx8="http://schemas.microsoft.com/office/drawing/2016/5/14/chartex" xmlns:mc="http://schemas.openxmlformats.org/markup-compatibility/2006" xmlns:aink="http://schemas.microsoft.com/office/drawing/2016/ink" xmlns:am3d="http://schemas.microsoft.com/office/drawing/2017/model3d" xmlns:o="urn:schemas-microsoft-com:office:office" xmlns:oel="http://schemas.microsoft.com/office/2019/extlst" xmlns:r="http://schemas.openxmlformats.org/officeDocument/2006/relationships" xmlns:m="http://schemas.openxmlformats.org/officeDocument/2006/math" xmlns:v="urn:schemas-microsoft-com:vml" xmlns:wp14="http://schemas.microsoft.com/office/word/2010/wordprocessingDrawing" xmlns:wp="http://schemas.openxmlformats.org/drawingml/2006/wordprocessingDrawing" xmlns:w10="urn:schemas-microsoft-com:office:word" xmlns:w="http://schemas.openxmlformats.org/wordprocessingml/2006/main" xmlns:w14="http://schemas.microsoft.com/office/word/2010/wordml" xmlns:w15="http://schemas.microsoft.com/office/word/2012/wordml" xmlns:w16cex="http://schemas.microsoft.com/office/word/2018/wordml/cex" xmlns:w16cid="http://schemas.microsoft.com/office/word/2016/wordml/cid" xmlns:w16="http://schemas.microsoft.com/office/word/2018/wordml" xmlns:w16du="http://schemas.microsoft.com/office/word/2023/wordml/word16du" xmlns:w16sdtdh="http://schemas.microsoft.com/office/word/2020/wordml/sdtdatahash" xmlns:w16sdtfl="http://schemas.microsoft.com/office/word/2024/wordml/sdtformatlock" xmlns:w16se="http://schemas.microsoft.com/office/word/2015/wordml/symex" xmlns:wpg="http://schemas.microsoft.com/office/word/2010/wordprocessingGroup" xmlns:wpi="http://schemas.microsoft.com/office/word/2010/wordprocessingInk" xmlns:wne="http://schemas.microsoft.com/office/word/2006/wordml" xmlns:wps="http://schemas.microsoft.com/office/word/2010/wordprocessingShape" mc:Ignorable="w14 w15 w16se w16cid w16 w16cex w16sdtdh w16sdtfl w16du wp14">
+<w:hdr xmlns:wpc="http://schemas.microsoft.com/office/word/2010/wordprocessingCanvas" xmlns:mc="http://schemas.openxmlformats.org/markup-compatibility/2006" xmlns:o="urn:schemas-microsoft-com:office:office" xmlns:r="http://schemas.openxmlformats.org/officeDocument/2006/relationships" xmlns:m="http://schemas.openxmlformats.org/officeDocument/2006/math" xmlns:v="urn:schemas-microsoft-com:vml" xmlns:wp14="http://schemas.microsoft.com/office/word/2010/wordprocessingDrawing" xmlns:wp="http://schemas.openxmlformats.org/drawingml/2006/wordprocessingDrawing" xmlns:w10="urn:schemas-microsoft-com:office:word" xmlns:w="http://schemas.openxmlformats.org/wordprocessingml/2006/main" xmlns:w14="http://schemas.microsoft.com/office/word/2010/wordml" xmlns:wpg="http://schemas.microsoft.com/office/word/2010/wordprocessingGroup" xmlns:wpi="http://schemas.microsoft.com/office/word/2010/wordprocessingInk" xmlns:wne="http://schemas.microsoft.com/office/word/2006/wordml" xmlns:wps="http://schemas.microsoft.com/office/word/2010/wordprocessingShape" mc:Ignorable="w14 wp14">
   <w:p>
     <w:pPr>
       <w:pStyle w:val="Header"/>
@@ -1231,8 +1395,8 @@
 </file>
 
 <file path=word/numbering.xml><?xml version="1.0" encoding="utf-8"?>
-<w:numbering xmlns:wpc="http://schemas.microsoft.com/office/word/2010/wordprocessingCanvas" xmlns:cx="http://schemas.microsoft.com/office/drawing/2014/chartex" xmlns:cx1="http://schemas.microsoft.com/office/drawing/2015/9/8/chartex" xmlns:cx2="http://schemas.microsoft.com/office/drawing/2015/10/21/chartex" xmlns:cx3="http://schemas.microsoft.com/office/drawing/2016/5/9/chartex" xmlns:cx4="http://schemas.microsoft.com/office/drawing/2016/5/10/chartex" xmlns:cx5="http://schemas.microsoft.com/office/drawing/2016/5/11/chartex" xmlns:cx6="http://schemas.microsoft.com/office/drawing/2016/5/12/chartex" xmlns:cx7="http://schemas.microsoft.com/office/drawing/2016/5/13/chartex" xmlns:cx8="http://schemas.microsoft.com/office/drawing/2016/5/14/chartex" xmlns:mc="http://schemas.openxmlformats.org/markup-compatibility/2006" xmlns:aink="http://schemas.microsoft.com/office/drawing/2016/ink" xmlns:am3d="http://schemas.microsoft.com/office/drawing/2017/model3d" xmlns:o="urn:schemas-microsoft-com:office:office" xmlns:oel="http://schemas.microsoft.com/office/2019/extlst" xmlns:r="http://schemas.openxmlformats.org/officeDocument/2006/relationships" xmlns:m="http://schemas.openxmlformats.org/officeDocument/2006/math" xmlns:v="urn:schemas-microsoft-com:vml" xmlns:wp14="http://schemas.microsoft.com/office/word/2010/wordprocessingDrawing" xmlns:wp="http://schemas.openxmlformats.org/drawingml/2006/wordprocessingDrawing" xmlns:w10="urn:schemas-microsoft-com:office:word" xmlns:w="http://schemas.openxmlformats.org/wordprocessingml/2006/main" xmlns:w14="http://schemas.microsoft.com/office/word/2010/wordml" xmlns:w15="http://schemas.microsoft.com/office/word/2012/wordml" xmlns:w16cex="http://schemas.microsoft.com/office/word/2018/wordml/cex" xmlns:w16cid="http://schemas.microsoft.com/office/word/2016/wordml/cid" xmlns:w16="http://schemas.microsoft.com/office/word/2018/wordml" xmlns:w16du="http://schemas.microsoft.com/office/word/2023/wordml/word16du" xmlns:w16sdtdh="http://schemas.microsoft.com/office/word/2020/wordml/sdtdatahash" xmlns:w16sdtfl="http://schemas.microsoft.com/office/word/2024/wordml/sdtformatlock" xmlns:w16se="http://schemas.microsoft.com/office/word/2015/wordml/symex" xmlns:wpg="http://schemas.microsoft.com/office/word/2010/wordprocessingGroup" xmlns:wpi="http://schemas.microsoft.com/office/word/2010/wordprocessingInk" xmlns:wne="http://schemas.microsoft.com/office/word/2006/wordml" xmlns:wps="http://schemas.microsoft.com/office/word/2010/wordprocessingShape" mc:Ignorable="w14 w15 w16se w16cid w16 w16cex w16sdtdh w16sdtfl w16du wp14">
-  <w:abstractNum w:abstractNumId="0" w15:restartNumberingAfterBreak="0">
+<w:numbering xmlns:wpc="http://schemas.microsoft.com/office/word/2010/wordprocessingCanvas" xmlns:mc="http://schemas.openxmlformats.org/markup-compatibility/2006" xmlns:o="urn:schemas-microsoft-com:office:office" xmlns:r="http://schemas.openxmlformats.org/officeDocument/2006/relationships" xmlns:m="http://schemas.openxmlformats.org/officeDocument/2006/math" xmlns:v="urn:schemas-microsoft-com:vml" xmlns:wp14="http://schemas.microsoft.com/office/word/2010/wordprocessingDrawing" xmlns:wp="http://schemas.openxmlformats.org/drawingml/2006/wordprocessingDrawing" xmlns:w10="urn:schemas-microsoft-com:office:word" xmlns:w="http://schemas.openxmlformats.org/wordprocessingml/2006/main" xmlns:w14="http://schemas.microsoft.com/office/word/2010/wordml" xmlns:wpg="http://schemas.microsoft.com/office/word/2010/wordprocessingGroup" xmlns:wpi="http://schemas.microsoft.com/office/word/2010/wordprocessingInk" xmlns:wne="http://schemas.microsoft.com/office/word/2006/wordml" xmlns:wps="http://schemas.microsoft.com/office/word/2010/wordprocessingShape" mc:Ignorable="w14 wp14">
+  <w:abstractNum w:abstractNumId="0">
     <w:nsid w:val="04BA7C89"/>
     <w:multiLevelType w:val="hybridMultilevel"/>
     <w:tmpl w:val="9BF44680"/>
@@ -1345,7 +1509,7 @@
       </w:rPr>
     </w:lvl>
   </w:abstractNum>
-  <w:abstractNum w:abstractNumId="1" w15:restartNumberingAfterBreak="0">
+  <w:abstractNum w:abstractNumId="1">
     <w:nsid w:val="14AD60D0"/>
     <w:multiLevelType w:val="hybridMultilevel"/>
     <w:tmpl w:val="4404B016"/>
@@ -1457,7 +1621,7 @@
       </w:rPr>
     </w:lvl>
   </w:abstractNum>
-  <w:abstractNum w:abstractNumId="2" w15:restartNumberingAfterBreak="0">
+  <w:abstractNum w:abstractNumId="2">
     <w:nsid w:val="285A9886"/>
     <w:multiLevelType w:val="hybridMultilevel"/>
     <w:tmpl w:val="ADE0FFA6"/>
@@ -1570,7 +1734,7 @@
       </w:rPr>
     </w:lvl>
   </w:abstractNum>
-  <w:abstractNum w:abstractNumId="3" w15:restartNumberingAfterBreak="0">
+  <w:abstractNum w:abstractNumId="3">
     <w:nsid w:val="3C714416"/>
     <w:multiLevelType w:val="hybridMultilevel"/>
     <w:tmpl w:val="A3B84C86"/>
@@ -1683,7 +1847,7 @@
       </w:rPr>
     </w:lvl>
   </w:abstractNum>
-  <w:abstractNum w:abstractNumId="4" w15:restartNumberingAfterBreak="0">
+  <w:abstractNum w:abstractNumId="4">
     <w:nsid w:val="48150A6A"/>
     <w:multiLevelType w:val="hybridMultilevel"/>
     <w:tmpl w:val="7152BA1C"/>
@@ -1796,7 +1960,7 @@
       </w:rPr>
     </w:lvl>
   </w:abstractNum>
-  <w:abstractNum w:abstractNumId="5" w15:restartNumberingAfterBreak="0">
+  <w:abstractNum w:abstractNumId="5">
     <w:nsid w:val="6466F475"/>
     <w:multiLevelType w:val="hybridMultilevel"/>
     <w:tmpl w:val="917CD8BE"/>
@@ -1909,7 +2073,7 @@
       </w:rPr>
     </w:lvl>
   </w:abstractNum>
-  <w:abstractNum w:abstractNumId="6" w15:restartNumberingAfterBreak="0">
+  <w:abstractNum w:abstractNumId="6">
     <w:nsid w:val="6CD30B67"/>
     <w:multiLevelType w:val="hybridMultilevel"/>
     <w:tmpl w:val="1D28DCF4"/>
@@ -2022,7 +2186,7 @@
       </w:rPr>
     </w:lvl>
   </w:abstractNum>
-  <w:abstractNum w:abstractNumId="7" w15:restartNumberingAfterBreak="0">
+  <w:abstractNum w:abstractNumId="7">
     <w:nsid w:val="6DFD2591"/>
     <w:multiLevelType w:val="hybridMultilevel"/>
     <w:tmpl w:val="1BCE01E2"/>
@@ -2135,7 +2299,7 @@
       </w:rPr>
     </w:lvl>
   </w:abstractNum>
-  <w:abstractNum w:abstractNumId="8" w15:restartNumberingAfterBreak="0">
+  <w:abstractNum w:abstractNumId="8">
     <w:nsid w:val="71C1852A"/>
     <w:multiLevelType w:val="hybridMultilevel"/>
     <w:tmpl w:val="6DB64836"/>
@@ -2248,38 +2412,38 @@
       </w:rPr>
     </w:lvl>
   </w:abstractNum>
-  <w:num w:numId="1" w16cid:durableId="1022703682">
+  <w:num w:numId="1">
     <w:abstractNumId w:val="7"/>
   </w:num>
-  <w:num w:numId="2" w16cid:durableId="1469011282">
+  <w:num w:numId="2">
     <w:abstractNumId w:val="0"/>
   </w:num>
-  <w:num w:numId="3" w16cid:durableId="974994594">
+  <w:num w:numId="3">
     <w:abstractNumId w:val="5"/>
   </w:num>
-  <w:num w:numId="4" w16cid:durableId="883251869">
+  <w:num w:numId="4">
     <w:abstractNumId w:val="8"/>
   </w:num>
-  <w:num w:numId="5" w16cid:durableId="657266061">
+  <w:num w:numId="5">
     <w:abstractNumId w:val="3"/>
   </w:num>
-  <w:num w:numId="6" w16cid:durableId="1173296967">
+  <w:num w:numId="6">
     <w:abstractNumId w:val="2"/>
   </w:num>
-  <w:num w:numId="7" w16cid:durableId="658309942">
+  <w:num w:numId="7">
     <w:abstractNumId w:val="6"/>
   </w:num>
-  <w:num w:numId="8" w16cid:durableId="859320332">
+  <w:num w:numId="8">
     <w:abstractNumId w:val="1"/>
   </w:num>
-  <w:num w:numId="9" w16cid:durableId="937830927">
+  <w:num w:numId="9">
     <w:abstractNumId w:val="4"/>
   </w:num>
 </w:numbering>
 </file>
 
 <file path=word/styles.xml><?xml version="1.0" encoding="utf-8"?>
-<w:styles xmlns:mc="http://schemas.openxmlformats.org/markup-compatibility/2006" xmlns:r="http://schemas.openxmlformats.org/officeDocument/2006/relationships" xmlns:w="http://schemas.openxmlformats.org/wordprocessingml/2006/main" xmlns:w14="http://schemas.microsoft.com/office/word/2010/wordml" xmlns:w15="http://schemas.microsoft.com/office/word/2012/wordml" xmlns:w16cex="http://schemas.microsoft.com/office/word/2018/wordml/cex" xmlns:w16cid="http://schemas.microsoft.com/office/word/2016/wordml/cid" xmlns:w16="http://schemas.microsoft.com/office/word/2018/wordml" xmlns:w16du="http://schemas.microsoft.com/office/word/2023/wordml/word16du" xmlns:w16sdtdh="http://schemas.microsoft.com/office/word/2020/wordml/sdtdatahash" xmlns:w16sdtfl="http://schemas.microsoft.com/office/word/2024/wordml/sdtformatlock" xmlns:w16se="http://schemas.microsoft.com/office/word/2015/wordml/symex" mc:Ignorable="w14 w15 w16se w16cid w16 w16cex w16sdtdh w16sdtfl w16du">
+<w:styles xmlns:mc="http://schemas.openxmlformats.org/markup-compatibility/2006" xmlns:r="http://schemas.openxmlformats.org/officeDocument/2006/relationships" xmlns:w="http://schemas.openxmlformats.org/wordprocessingml/2006/main" xmlns:w14="http://schemas.microsoft.com/office/word/2010/wordml" mc:Ignorable="w14">
   <w:docDefaults>
     <w:rPrDefault>
       <w:rPr>
@@ -2297,383 +2461,471 @@
       </w:pPr>
     </w:pPrDefault>
   </w:docDefaults>
-  <w:latentStyles w:defLockedState="0" w:defUIPriority="99" w:defSemiHidden="0" w:defUnhideWhenUsed="0" w:defQFormat="0" w:count="376">
-    <w:lsdException w:name="Normal" w:uiPriority="0" w:qFormat="1"/>
-    <w:lsdException w:name="heading 1" w:uiPriority="9" w:qFormat="1"/>
-    <w:lsdException w:name="heading 2" w:semiHidden="1" w:uiPriority="9" w:unhideWhenUsed="1" w:qFormat="1"/>
-    <w:lsdException w:name="heading 3" w:semiHidden="1" w:uiPriority="9" w:unhideWhenUsed="1" w:qFormat="1"/>
-    <w:lsdException w:name="heading 4" w:semiHidden="1" w:uiPriority="9" w:unhideWhenUsed="1" w:qFormat="1"/>
-    <w:lsdException w:name="heading 5" w:semiHidden="1" w:uiPriority="9" w:unhideWhenUsed="1" w:qFormat="1"/>
-    <w:lsdException w:name="heading 6" w:semiHidden="1" w:uiPriority="9" w:unhideWhenUsed="1" w:qFormat="1"/>
-    <w:lsdException w:name="heading 7" w:semiHidden="1" w:uiPriority="9" w:unhideWhenUsed="1" w:qFormat="1"/>
-    <w:lsdException w:name="heading 8" w:semiHidden="1" w:uiPriority="9" w:unhideWhenUsed="1" w:qFormat="1"/>
-    <w:lsdException w:name="heading 9" w:semiHidden="1" w:uiPriority="9" w:unhideWhenUsed="1" w:qFormat="1"/>
-    <w:lsdException w:name="index 1" w:semiHidden="1" w:unhideWhenUsed="1"/>
-    <w:lsdException w:name="index 2" w:semiHidden="1" w:unhideWhenUsed="1"/>
-    <w:lsdException w:name="index 3" w:semiHidden="1" w:unhideWhenUsed="1"/>
-    <w:lsdException w:name="index 4" w:semiHidden="1" w:unhideWhenUsed="1"/>
-    <w:lsdException w:name="index 5" w:semiHidden="1" w:unhideWhenUsed="1"/>
-    <w:lsdException w:name="index 6" w:semiHidden="1" w:unhideWhenUsed="1"/>
-    <w:lsdException w:name="index 7" w:semiHidden="1" w:unhideWhenUsed="1"/>
-    <w:lsdException w:name="index 8" w:semiHidden="1" w:unhideWhenUsed="1"/>
-    <w:lsdException w:name="index 9" w:semiHidden="1" w:unhideWhenUsed="1"/>
-    <w:lsdException w:name="toc 1" w:semiHidden="1" w:uiPriority="39" w:unhideWhenUsed="1"/>
-    <w:lsdException w:name="toc 2" w:semiHidden="1" w:uiPriority="39" w:unhideWhenUsed="1"/>
-    <w:lsdException w:name="toc 3" w:semiHidden="1" w:uiPriority="39" w:unhideWhenUsed="1"/>
-    <w:lsdException w:name="toc 4" w:semiHidden="1" w:uiPriority="39" w:unhideWhenUsed="1"/>
-    <w:lsdException w:name="toc 5" w:semiHidden="1" w:uiPriority="39" w:unhideWhenUsed="1"/>
-    <w:lsdException w:name="toc 6" w:semiHidden="1" w:uiPriority="39" w:unhideWhenUsed="1"/>
-    <w:lsdException w:name="toc 7" w:semiHidden="1" w:uiPriority="39" w:unhideWhenUsed="1"/>
-    <w:lsdException w:name="toc 8" w:semiHidden="1" w:uiPriority="39" w:unhideWhenUsed="1"/>
-    <w:lsdException w:name="toc 9" w:semiHidden="1" w:uiPriority="39" w:unhideWhenUsed="1"/>
-    <w:lsdException w:name="Normal Indent" w:semiHidden="1" w:unhideWhenUsed="1"/>
-    <w:lsdException w:name="footnote text" w:semiHidden="1" w:unhideWhenUsed="1"/>
-    <w:lsdException w:name="annotation text" w:semiHidden="1" w:unhideWhenUsed="1"/>
-    <w:lsdException w:name="header" w:semiHidden="1" w:unhideWhenUsed="1"/>
-    <w:lsdException w:name="footer" w:semiHidden="1" w:unhideWhenUsed="1"/>
-    <w:lsdException w:name="index heading" w:semiHidden="1" w:unhideWhenUsed="1"/>
-    <w:lsdException w:name="caption" w:semiHidden="1" w:uiPriority="35" w:unhideWhenUsed="1" w:qFormat="1"/>
-    <w:lsdException w:name="table of figures" w:semiHidden="1" w:unhideWhenUsed="1"/>
-    <w:lsdException w:name="envelope address" w:semiHidden="1" w:unhideWhenUsed="1"/>
-    <w:lsdException w:name="envelope return" w:semiHidden="1" w:unhideWhenUsed="1"/>
-    <w:lsdException w:name="footnote reference" w:semiHidden="1" w:unhideWhenUsed="1"/>
-    <w:lsdException w:name="annotation reference" w:semiHidden="1" w:unhideWhenUsed="1"/>
-    <w:lsdException w:name="line number" w:semiHidden="1" w:unhideWhenUsed="1"/>
-    <w:lsdException w:name="page number" w:semiHidden="1" w:unhideWhenUsed="1"/>
-    <w:lsdException w:name="endnote reference" w:semiHidden="1" w:unhideWhenUsed="1"/>
-    <w:lsdException w:name="endnote text" w:semiHidden="1" w:unhideWhenUsed="1"/>
-    <w:lsdException w:name="table of authorities" w:semiHidden="1" w:unhideWhenUsed="1"/>
-    <w:lsdException w:name="macro" w:semiHidden="1" w:unhideWhenUsed="1"/>
-    <w:lsdException w:name="toa heading" w:semiHidden="1" w:unhideWhenUsed="1"/>
-    <w:lsdException w:name="List" w:semiHidden="1" w:unhideWhenUsed="1"/>
-    <w:lsdException w:name="List Bullet" w:semiHidden="1" w:unhideWhenUsed="1"/>
-    <w:lsdException w:name="List Number" w:semiHidden="1" w:unhideWhenUsed="1"/>
-    <w:lsdException w:name="List 2" w:semiHidden="1" w:unhideWhenUsed="1"/>
-    <w:lsdException w:name="List 3" w:semiHidden="1" w:unhideWhenUsed="1"/>
-    <w:lsdException w:name="List 4" w:semiHidden="1" w:unhideWhenUsed="1"/>
-    <w:lsdException w:name="List 5" w:semiHidden="1" w:unhideWhenUsed="1"/>
-    <w:lsdException w:name="List Bullet 2" w:semiHidden="1" w:unhideWhenUsed="1"/>
-    <w:lsdException w:name="List Bullet 3" w:semiHidden="1" w:unhideWhenUsed="1"/>
-    <w:lsdException w:name="List Bullet 4" w:semiHidden="1" w:unhideWhenUsed="1"/>
-    <w:lsdException w:name="List Bullet 5" w:semiHidden="1" w:unhideWhenUsed="1"/>
-    <w:lsdException w:name="List Number 2" w:semiHidden="1" w:unhideWhenUsed="1"/>
-    <w:lsdException w:name="List Number 3" w:semiHidden="1" w:unhideWhenUsed="1"/>
-    <w:lsdException w:name="List Number 4" w:semiHidden="1" w:unhideWhenUsed="1"/>
-    <w:lsdException w:name="List Number 5" w:semiHidden="1" w:unhideWhenUsed="1"/>
-    <w:lsdException w:name="Title" w:uiPriority="10" w:qFormat="1"/>
-    <w:lsdException w:name="Closing" w:semiHidden="1" w:unhideWhenUsed="1"/>
-    <w:lsdException w:name="Signature" w:semiHidden="1" w:unhideWhenUsed="1"/>
-    <w:lsdException w:name="Default Paragraph Font" w:semiHidden="1" w:uiPriority="1" w:unhideWhenUsed="1"/>
-    <w:lsdException w:name="Body Text" w:semiHidden="1" w:unhideWhenUsed="1"/>
-    <w:lsdException w:name="Body Text Indent" w:semiHidden="1" w:unhideWhenUsed="1"/>
-    <w:lsdException w:name="List Continue" w:semiHidden="1" w:unhideWhenUsed="1"/>
-    <w:lsdException w:name="List Continue 2" w:semiHidden="1" w:unhideWhenUsed="1"/>
-    <w:lsdException w:name="List Continue 3" w:semiHidden="1" w:unhideWhenUsed="1"/>
-    <w:lsdException w:name="List Continue 4" w:semiHidden="1" w:unhideWhenUsed="1"/>
-    <w:lsdException w:name="List Continue 5" w:semiHidden="1" w:unhideWhenUsed="1"/>
-    <w:lsdException w:name="Message Header" w:semiHidden="1" w:unhideWhenUsed="1"/>
-    <w:lsdException w:name="Subtitle" w:uiPriority="11" w:qFormat="1"/>
-    <w:lsdException w:name="Salutation" w:semiHidden="1" w:unhideWhenUsed="1"/>
-    <w:lsdException w:name="Date" w:semiHidden="1" w:unhideWhenUsed="1"/>
-    <w:lsdException w:name="Body Text First Indent" w:semiHidden="1" w:unhideWhenUsed="1"/>
-    <w:lsdException w:name="Body Text First Indent 2" w:semiHidden="1" w:unhideWhenUsed="1"/>
-    <w:lsdException w:name="Note Heading" w:semiHidden="1" w:unhideWhenUsed="1"/>
-    <w:lsdException w:name="Body Text 2" w:semiHidden="1" w:unhideWhenUsed="1"/>
-    <w:lsdException w:name="Body Text 3" w:semiHidden="1" w:unhideWhenUsed="1"/>
-    <w:lsdException w:name="Body Text Indent 2" w:semiHidden="1" w:unhideWhenUsed="1"/>
-    <w:lsdException w:name="Body Text Indent 3" w:semiHidden="1" w:unhideWhenUsed="1"/>
-    <w:lsdException w:name="Block Text" w:semiHidden="1" w:unhideWhenUsed="1"/>
-    <w:lsdException w:name="Hyperlink" w:semiHidden="1" w:unhideWhenUsed="1"/>
-    <w:lsdException w:name="FollowedHyperlink" w:semiHidden="1" w:unhideWhenUsed="1"/>
-    <w:lsdException w:name="Strong" w:uiPriority="22" w:qFormat="1"/>
-    <w:lsdException w:name="Emphasis" w:uiPriority="20" w:qFormat="1"/>
-    <w:lsdException w:name="Document Map" w:semiHidden="1" w:unhideWhenUsed="1"/>
-    <w:lsdException w:name="Plain Text" w:semiHidden="1" w:unhideWhenUsed="1"/>
-    <w:lsdException w:name="E-mail Signature" w:semiHidden="1" w:unhideWhenUsed="1"/>
-    <w:lsdException w:name="HTML Top of Form" w:semiHidden="1" w:unhideWhenUsed="1"/>
-    <w:lsdException w:name="HTML Bottom of Form" w:semiHidden="1" w:unhideWhenUsed="1"/>
-    <w:lsdException w:name="Normal (Web)" w:semiHidden="1" w:unhideWhenUsed="1"/>
-    <w:lsdException w:name="HTML Acronym" w:semiHidden="1" w:unhideWhenUsed="1"/>
-    <w:lsdException w:name="HTML Address" w:semiHidden="1" w:unhideWhenUsed="1"/>
-    <w:lsdException w:name="HTML Cite" w:semiHidden="1" w:unhideWhenUsed="1"/>
-    <w:lsdException w:name="HTML Code" w:semiHidden="1" w:unhideWhenUsed="1"/>
-    <w:lsdException w:name="HTML Definition" w:semiHidden="1" w:unhideWhenUsed="1"/>
-    <w:lsdException w:name="HTML Keyboard" w:semiHidden="1" w:unhideWhenUsed="1"/>
-    <w:lsdException w:name="HTML Preformatted" w:semiHidden="1" w:unhideWhenUsed="1"/>
-    <w:lsdException w:name="HTML Sample" w:semiHidden="1" w:unhideWhenUsed="1"/>
-    <w:lsdException w:name="HTML Typewriter" w:semiHidden="1" w:unhideWhenUsed="1"/>
-    <w:lsdException w:name="HTML Variable" w:semiHidden="1" w:unhideWhenUsed="1"/>
-    <w:lsdException w:name="Normal Table" w:semiHidden="1" w:unhideWhenUsed="1"/>
-    <w:lsdException w:name="annotation subject" w:semiHidden="1" w:unhideWhenUsed="1"/>
-    <w:lsdException w:name="No List" w:semiHidden="1" w:unhideWhenUsed="1"/>
-    <w:lsdException w:name="Outline List 1" w:semiHidden="1" w:unhideWhenUsed="1"/>
-    <w:lsdException w:name="Outline List 2" w:semiHidden="1" w:unhideWhenUsed="1"/>
-    <w:lsdException w:name="Outline List 3" w:semiHidden="1" w:unhideWhenUsed="1"/>
-    <w:lsdException w:name="Table Simple 1" w:semiHidden="1" w:unhideWhenUsed="1"/>
-    <w:lsdException w:name="Table Simple 2" w:semiHidden="1" w:unhideWhenUsed="1"/>
-    <w:lsdException w:name="Table Simple 3" w:semiHidden="1" w:unhideWhenUsed="1"/>
-    <w:lsdException w:name="Table Classic 1" w:semiHidden="1" w:unhideWhenUsed="1"/>
-    <w:lsdException w:name="Table Classic 2" w:semiHidden="1" w:unhideWhenUsed="1"/>
-    <w:lsdException w:name="Table Classic 3" w:semiHidden="1" w:unhideWhenUsed="1"/>
-    <w:lsdException w:name="Table Classic 4" w:semiHidden="1" w:unhideWhenUsed="1"/>
-    <w:lsdException w:name="Table Colorful 1" w:semiHidden="1" w:unhideWhenUsed="1"/>
-    <w:lsdException w:name="Table Colorful 2" w:semiHidden="1" w:unhideWhenUsed="1"/>
-    <w:lsdException w:name="Table Colorful 3" w:semiHidden="1" w:unhideWhenUsed="1"/>
-    <w:lsdException w:name="Table Columns 1" w:semiHidden="1" w:unhideWhenUsed="1"/>
-    <w:lsdException w:name="Table Columns 2" w:semiHidden="1" w:unhideWhenUsed="1"/>
-    <w:lsdException w:name="Table Columns 3" w:semiHidden="1" w:unhideWhenUsed="1"/>
-    <w:lsdException w:name="Table Columns 4" w:semiHidden="1" w:unhideWhenUsed="1"/>
-    <w:lsdException w:name="Table Columns 5" w:semiHidden="1" w:unhideWhenUsed="1"/>
-    <w:lsdException w:name="Table Grid 1" w:semiHidden="1" w:unhideWhenUsed="1"/>
-    <w:lsdException w:name="Table Grid 2" w:semiHidden="1" w:unhideWhenUsed="1"/>
-    <w:lsdException w:name="Table Grid 3" w:semiHidden="1" w:unhideWhenUsed="1"/>
-    <w:lsdException w:name="Table Grid 4" w:semiHidden="1" w:unhideWhenUsed="1"/>
-    <w:lsdException w:name="Table Grid 5" w:semiHidden="1" w:unhideWhenUsed="1"/>
-    <w:lsdException w:name="Table Grid 6" w:semiHidden="1" w:unhideWhenUsed="1"/>
-    <w:lsdException w:name="Table Grid 7" w:semiHidden="1" w:unhideWhenUsed="1"/>
-    <w:lsdException w:name="Table Grid 8" w:semiHidden="1" w:unhideWhenUsed="1"/>
-    <w:lsdException w:name="Table List 1" w:semiHidden="1" w:unhideWhenUsed="1"/>
-    <w:lsdException w:name="Table List 2" w:semiHidden="1" w:unhideWhenUsed="1"/>
-    <w:lsdException w:name="Table List 3" w:semiHidden="1" w:unhideWhenUsed="1"/>
-    <w:lsdException w:name="Table List 4" w:semiHidden="1" w:unhideWhenUsed="1"/>
-    <w:lsdException w:name="Table List 5" w:semiHidden="1" w:unhideWhenUsed="1"/>
-    <w:lsdException w:name="Table List 6" w:semiHidden="1" w:unhideWhenUsed="1"/>
-    <w:lsdException w:name="Table List 7" w:semiHidden="1" w:unhideWhenUsed="1"/>
-    <w:lsdException w:name="Table List 8" w:semiHidden="1" w:unhideWhenUsed="1"/>
-    <w:lsdException w:name="Table 3D effects 1" w:semiHidden="1" w:unhideWhenUsed="1"/>
-    <w:lsdException w:name="Table 3D effects 2" w:semiHidden="1" w:unhideWhenUsed="1"/>
-    <w:lsdException w:name="Table 3D effects 3" w:semiHidden="1" w:unhideWhenUsed="1"/>
-    <w:lsdException w:name="Table Contemporary" w:semiHidden="1" w:unhideWhenUsed="1"/>
-    <w:lsdException w:name="Table Elegant" w:semiHidden="1" w:unhideWhenUsed="1"/>
-    <w:lsdException w:name="Table Professional" w:semiHidden="1" w:unhideWhenUsed="1"/>
-    <w:lsdException w:name="Table Subtle 1" w:semiHidden="1" w:unhideWhenUsed="1"/>
-    <w:lsdException w:name="Table Subtle 2" w:semiHidden="1" w:unhideWhenUsed="1"/>
-    <w:lsdException w:name="Table Web 1" w:semiHidden="1" w:unhideWhenUsed="1"/>
-    <w:lsdException w:name="Table Web 2" w:semiHidden="1" w:unhideWhenUsed="1"/>
-    <w:lsdException w:name="Table Web 3" w:semiHidden="1" w:unhideWhenUsed="1"/>
-    <w:lsdException w:name="Balloon Text" w:semiHidden="1" w:unhideWhenUsed="1"/>
-    <w:lsdException w:name="Table Grid" w:uiPriority="59"/>
-    <w:lsdException w:name="Table Theme" w:semiHidden="1" w:unhideWhenUsed="1"/>
-    <w:lsdException w:name="Placeholder Text" w:semiHidden="1"/>
-    <w:lsdException w:name="No Spacing" w:uiPriority="1" w:qFormat="1"/>
-    <w:lsdException w:name="Light Shading" w:uiPriority="60"/>
-    <w:lsdException w:name="Light List" w:uiPriority="61"/>
-    <w:lsdException w:name="Light Grid" w:uiPriority="62"/>
-    <w:lsdException w:name="Medium Shading 1" w:uiPriority="63"/>
-    <w:lsdException w:name="Medium Shading 2" w:uiPriority="64"/>
-    <w:lsdException w:name="Medium List 1" w:uiPriority="65"/>
-    <w:lsdException w:name="Medium List 2" w:uiPriority="66"/>
-    <w:lsdException w:name="Medium Grid 1" w:uiPriority="67"/>
-    <w:lsdException w:name="Medium Grid 2" w:uiPriority="68"/>
-    <w:lsdException w:name="Medium Grid 3" w:uiPriority="69"/>
-    <w:lsdException w:name="Dark List" w:uiPriority="70"/>
-    <w:lsdException w:name="Colorful Shading" w:uiPriority="71"/>
-    <w:lsdException w:name="Colorful List" w:uiPriority="72"/>
-    <w:lsdException w:name="Colorful Grid" w:uiPriority="73"/>
-    <w:lsdException w:name="Light Shading Accent 1" w:uiPriority="60"/>
-    <w:lsdException w:name="Light List Accent 1" w:uiPriority="61"/>
-    <w:lsdException w:name="Light Grid Accent 1" w:uiPriority="62"/>
-    <w:lsdException w:name="Medium Shading 1 Accent 1" w:uiPriority="63"/>
-    <w:lsdException w:name="Medium Shading 2 Accent 1" w:uiPriority="64"/>
-    <w:lsdException w:name="Medium List 1 Accent 1" w:uiPriority="65"/>
-    <w:lsdException w:name="Revision" w:semiHidden="1"/>
-    <w:lsdException w:name="List Paragraph" w:uiPriority="34" w:qFormat="1"/>
-    <w:lsdException w:name="Quote" w:uiPriority="29" w:qFormat="1"/>
-    <w:lsdException w:name="Intense Quote" w:uiPriority="30" w:qFormat="1"/>
-    <w:lsdException w:name="Medium List 2 Accent 1" w:uiPriority="66"/>
-    <w:lsdException w:name="Medium Grid 1 Accent 1" w:uiPriority="67"/>
-    <w:lsdException w:name="Medium Grid 2 Accent 1" w:uiPriority="68"/>
-    <w:lsdException w:name="Medium Grid 3 Accent 1" w:uiPriority="69"/>
-    <w:lsdException w:name="Dark List Accent 1" w:uiPriority="70"/>
-    <w:lsdException w:name="Colorful Shading Accent 1" w:uiPriority="71"/>
-    <w:lsdException w:name="Colorful List Accent 1" w:uiPriority="72"/>
-    <w:lsdException w:name="Colorful Grid Accent 1" w:uiPriority="73"/>
-    <w:lsdException w:name="Light Shading Accent 2" w:uiPriority="60"/>
-    <w:lsdException w:name="Light List Accent 2" w:uiPriority="61"/>
-    <w:lsdException w:name="Light Grid Accent 2" w:uiPriority="62"/>
-    <w:lsdException w:name="Medium Shading 1 Accent 2" w:uiPriority="63"/>
-    <w:lsdException w:name="Medium Shading 2 Accent 2" w:uiPriority="64"/>
-    <w:lsdException w:name="Medium List 1 Accent 2" w:uiPriority="65"/>
-    <w:lsdException w:name="Medium List 2 Accent 2" w:uiPriority="66"/>
-    <w:lsdException w:name="Medium Grid 1 Accent 2" w:uiPriority="67"/>
-    <w:lsdException w:name="Medium Grid 2 Accent 2" w:uiPriority="68"/>
-    <w:lsdException w:name="Medium Grid 3 Accent 2" w:uiPriority="69"/>
-    <w:lsdException w:name="Dark List Accent 2" w:uiPriority="70"/>
-    <w:lsdException w:name="Colorful Shading Accent 2" w:uiPriority="71"/>
-    <w:lsdException w:name="Colorful List Accent 2" w:uiPriority="72"/>
-    <w:lsdException w:name="Colorful Grid Accent 2" w:uiPriority="73"/>
-    <w:lsdException w:name="Light Shading Accent 3" w:uiPriority="60"/>
-    <w:lsdException w:name="Light List Accent 3" w:uiPriority="61"/>
-    <w:lsdException w:name="Light Grid Accent 3" w:uiPriority="62"/>
-    <w:lsdException w:name="Medium Shading 1 Accent 3" w:uiPriority="63"/>
-    <w:lsdException w:name="Medium Shading 2 Accent 3" w:uiPriority="64"/>
-    <w:lsdException w:name="Medium List 1 Accent 3" w:uiPriority="65"/>
-    <w:lsdException w:name="Medium List 2 Accent 3" w:uiPriority="66"/>
-    <w:lsdException w:name="Medium Grid 1 Accent 3" w:uiPriority="67"/>
-    <w:lsdException w:name="Medium Grid 2 Accent 3" w:uiPriority="68"/>
-    <w:lsdException w:name="Medium Grid 3 Accent 3" w:uiPriority="69"/>
-    <w:lsdException w:name="Dark List Accent 3" w:uiPriority="70"/>
-    <w:lsdException w:name="Colorful Shading Accent 3" w:uiPriority="71"/>
-    <w:lsdException w:name="Colorful List Accent 3" w:uiPriority="72"/>
-    <w:lsdException w:name="Colorful Grid Accent 3" w:uiPriority="73"/>
-    <w:lsdException w:name="Light Shading Accent 4" w:uiPriority="60"/>
-    <w:lsdException w:name="Light List Accent 4" w:uiPriority="61"/>
-    <w:lsdException w:name="Light Grid Accent 4" w:uiPriority="62"/>
-    <w:lsdException w:name="Medium Shading 1 Accent 4" w:uiPriority="63"/>
-    <w:lsdException w:name="Medium Shading 2 Accent 4" w:uiPriority="64"/>
-    <w:lsdException w:name="Medium List 1 Accent 4" w:uiPriority="65"/>
-    <w:lsdException w:name="Medium List 2 Accent 4" w:uiPriority="66"/>
-    <w:lsdException w:name="Medium Grid 1 Accent 4" w:uiPriority="67"/>
-    <w:lsdException w:name="Medium Grid 2 Accent 4" w:uiPriority="68"/>
-    <w:lsdException w:name="Medium Grid 3 Accent 4" w:uiPriority="69"/>
-    <w:lsdException w:name="Dark List Accent 4" w:uiPriority="70"/>
-    <w:lsdException w:name="Colorful Shading Accent 4" w:uiPriority="71"/>
-    <w:lsdException w:name="Colorful List Accent 4" w:uiPriority="72"/>
-    <w:lsdException w:name="Colorful Grid Accent 4" w:uiPriority="73"/>
-    <w:lsdException w:name="Light Shading Accent 5" w:uiPriority="60"/>
-    <w:lsdException w:name="Light List Accent 5" w:uiPriority="61"/>
-    <w:lsdException w:name="Light Grid Accent 5" w:uiPriority="62"/>
-    <w:lsdException w:name="Medium Shading 1 Accent 5" w:uiPriority="63"/>
-    <w:lsdException w:name="Medium Shading 2 Accent 5" w:uiPriority="64"/>
-    <w:lsdException w:name="Medium List 1 Accent 5" w:uiPriority="65"/>
-    <w:lsdException w:name="Medium List 2 Accent 5" w:uiPriority="66"/>
-    <w:lsdException w:name="Medium Grid 1 Accent 5" w:uiPriority="67"/>
-    <w:lsdException w:name="Medium Grid 2 Accent 5" w:uiPriority="68"/>
-    <w:lsdException w:name="Medium Grid 3 Accent 5" w:uiPriority="69"/>
-    <w:lsdException w:name="Dark List Accent 5" w:uiPriority="70"/>
-    <w:lsdException w:name="Colorful Shading Accent 5" w:uiPriority="71"/>
-    <w:lsdException w:name="Colorful List Accent 5" w:uiPriority="72"/>
-    <w:lsdException w:name="Colorful Grid Accent 5" w:uiPriority="73"/>
-    <w:lsdException w:name="Light Shading Accent 6" w:uiPriority="60"/>
-    <w:lsdException w:name="Light List Accent 6" w:uiPriority="61"/>
-    <w:lsdException w:name="Light Grid Accent 6" w:uiPriority="62"/>
-    <w:lsdException w:name="Medium Shading 1 Accent 6" w:uiPriority="63"/>
-    <w:lsdException w:name="Medium Shading 2 Accent 6" w:uiPriority="64"/>
-    <w:lsdException w:name="Medium List 1 Accent 6" w:uiPriority="65"/>
-    <w:lsdException w:name="Medium List 2 Accent 6" w:uiPriority="66"/>
-    <w:lsdException w:name="Medium Grid 1 Accent 6" w:uiPriority="67"/>
-    <w:lsdException w:name="Medium Grid 2 Accent 6" w:uiPriority="68"/>
-    <w:lsdException w:name="Medium Grid 3 Accent 6" w:uiPriority="69"/>
-    <w:lsdException w:name="Dark List Accent 6" w:uiPriority="70"/>
-    <w:lsdException w:name="Colorful Shading Accent 6" w:uiPriority="71"/>
-    <w:lsdException w:name="Colorful List Accent 6" w:uiPriority="72"/>
-    <w:lsdException w:name="Colorful Grid Accent 6" w:uiPriority="73"/>
-    <w:lsdException w:name="Subtle Emphasis" w:uiPriority="19" w:qFormat="1"/>
-    <w:lsdException w:name="Intense Emphasis" w:uiPriority="21" w:qFormat="1"/>
-    <w:lsdException w:name="Subtle Reference" w:uiPriority="31" w:qFormat="1"/>
-    <w:lsdException w:name="Intense Reference" w:uiPriority="32" w:qFormat="1"/>
-    <w:lsdException w:name="Book Title" w:uiPriority="33" w:qFormat="1"/>
-    <w:lsdException w:name="Bibliography" w:semiHidden="1" w:uiPriority="37" w:unhideWhenUsed="1"/>
-    <w:lsdException w:name="TOC Heading" w:semiHidden="1" w:uiPriority="39" w:unhideWhenUsed="1" w:qFormat="1"/>
-    <w:lsdException w:name="Plain Table 1" w:uiPriority="41"/>
-    <w:lsdException w:name="Plain Table 2" w:uiPriority="42"/>
-    <w:lsdException w:name="Plain Table 3" w:uiPriority="43"/>
-    <w:lsdException w:name="Plain Table 4" w:uiPriority="44"/>
-    <w:lsdException w:name="Plain Table 5" w:uiPriority="45"/>
-    <w:lsdException w:name="Grid Table Light" w:uiPriority="40"/>
-    <w:lsdException w:name="Grid Table 1 Light" w:uiPriority="46"/>
-    <w:lsdException w:name="Grid Table 2" w:uiPriority="47"/>
-    <w:lsdException w:name="Grid Table 3" w:uiPriority="48"/>
-    <w:lsdException w:name="Grid Table 4" w:uiPriority="49"/>
-    <w:lsdException w:name="Grid Table 5 Dark" w:uiPriority="50"/>
-    <w:lsdException w:name="Grid Table 6 Colorful" w:uiPriority="51"/>
-    <w:lsdException w:name="Grid Table 7 Colorful" w:uiPriority="52"/>
-    <w:lsdException w:name="Grid Table 1 Light Accent 1" w:uiPriority="46"/>
-    <w:lsdException w:name="Grid Table 2 Accent 1" w:uiPriority="47"/>
-    <w:lsdException w:name="Grid Table 3 Accent 1" w:uiPriority="48"/>
-    <w:lsdException w:name="Grid Table 4 Accent 1" w:uiPriority="49"/>
-    <w:lsdException w:name="Grid Table 5 Dark Accent 1" w:uiPriority="50"/>
-    <w:lsdException w:name="Grid Table 6 Colorful Accent 1" w:uiPriority="51"/>
-    <w:lsdException w:name="Grid Table 7 Colorful Accent 1" w:uiPriority="52"/>
-    <w:lsdException w:name="Grid Table 1 Light Accent 2" w:uiPriority="46"/>
-    <w:lsdException w:name="Grid Table 2 Accent 2" w:uiPriority="47"/>
-    <w:lsdException w:name="Grid Table 3 Accent 2" w:uiPriority="48"/>
-    <w:lsdException w:name="Grid Table 4 Accent 2" w:uiPriority="49"/>
-    <w:lsdException w:name="Grid Table 5 Dark Accent 2" w:uiPriority="50"/>
-    <w:lsdException w:name="Grid Table 6 Colorful Accent 2" w:uiPriority="51"/>
-    <w:lsdException w:name="Grid Table 7 Colorful Accent 2" w:uiPriority="52"/>
-    <w:lsdException w:name="Grid Table 1 Light Accent 3" w:uiPriority="46"/>
-    <w:lsdException w:name="Grid Table 2 Accent 3" w:uiPriority="47"/>
-    <w:lsdException w:name="Grid Table 3 Accent 3" w:uiPriority="48"/>
-    <w:lsdException w:name="Grid Table 4 Accent 3" w:uiPriority="49"/>
-    <w:lsdException w:name="Grid Table 5 Dark Accent 3" w:uiPriority="50"/>
-    <w:lsdException w:name="Grid Table 6 Colorful Accent 3" w:uiPriority="51"/>
-    <w:lsdException w:name="Grid Table 7 Colorful Accent 3" w:uiPriority="52"/>
-    <w:lsdException w:name="Grid Table 1 Light Accent 4" w:uiPriority="46"/>
-    <w:lsdException w:name="Grid Table 2 Accent 4" w:uiPriority="47"/>
-    <w:lsdException w:name="Grid Table 3 Accent 4" w:uiPriority="48"/>
-    <w:lsdException w:name="Grid Table 4 Accent 4" w:uiPriority="49"/>
-    <w:lsdException w:name="Grid Table 5 Dark Accent 4" w:uiPriority="50"/>
-    <w:lsdException w:name="Grid Table 6 Colorful Accent 4" w:uiPriority="51"/>
-    <w:lsdException w:name="Grid Table 7 Colorful Accent 4" w:uiPriority="52"/>
-    <w:lsdException w:name="Grid Table 1 Light Accent 5" w:uiPriority="46"/>
-    <w:lsdException w:name="Grid Table 2 Accent 5" w:uiPriority="47"/>
-    <w:lsdException w:name="Grid Table 3 Accent 5" w:uiPriority="48"/>
-    <w:lsdException w:name="Grid Table 4 Accent 5" w:uiPriority="49"/>
-    <w:lsdException w:name="Grid Table 5 Dark Accent 5" w:uiPriority="50"/>
-    <w:lsdException w:name="Grid Table 6 Colorful Accent 5" w:uiPriority="51"/>
-    <w:lsdException w:name="Grid Table 7 Colorful Accent 5" w:uiPriority="52"/>
-    <w:lsdException w:name="Grid Table 1 Light Accent 6" w:uiPriority="46"/>
-    <w:lsdException w:name="Grid Table 2 Accent 6" w:uiPriority="47"/>
-    <w:lsdException w:name="Grid Table 3 Accent 6" w:uiPriority="48"/>
-    <w:lsdException w:name="Grid Table 4 Accent 6" w:uiPriority="49"/>
-    <w:lsdException w:name="Grid Table 5 Dark Accent 6" w:uiPriority="50"/>
-    <w:lsdException w:name="Grid Table 6 Colorful Accent 6" w:uiPriority="51"/>
-    <w:lsdException w:name="Grid Table 7 Colorful Accent 6" w:uiPriority="52"/>
-    <w:lsdException w:name="List Table 1 Light" w:uiPriority="46"/>
-    <w:lsdException w:name="List Table 2" w:uiPriority="47"/>
-    <w:lsdException w:name="List Table 3" w:uiPriority="48"/>
-    <w:lsdException w:name="List Table 4" w:uiPriority="49"/>
-    <w:lsdException w:name="List Table 5 Dark" w:uiPriority="50"/>
-    <w:lsdException w:name="List Table 6 Colorful" w:uiPriority="51"/>
-    <w:lsdException w:name="List Table 7 Colorful" w:uiPriority="52"/>
-    <w:lsdException w:name="List Table 1 Light Accent 1" w:uiPriority="46"/>
-    <w:lsdException w:name="List Table 2 Accent 1" w:uiPriority="47"/>
-    <w:lsdException w:name="List Table 3 Accent 1" w:uiPriority="48"/>
-    <w:lsdException w:name="List Table 4 Accent 1" w:uiPriority="49"/>
-    <w:lsdException w:name="List Table 5 Dark Accent 1" w:uiPriority="50"/>
-    <w:lsdException w:name="List Table 6 Colorful Accent 1" w:uiPriority="51"/>
-    <w:lsdException w:name="List Table 7 Colorful Accent 1" w:uiPriority="52"/>
-    <w:lsdException w:name="List Table 1 Light Accent 2" w:uiPriority="46"/>
-    <w:lsdException w:name="List Table 2 Accent 2" w:uiPriority="47"/>
-    <w:lsdException w:name="List Table 3 Accent 2" w:uiPriority="48"/>
-    <w:lsdException w:name="List Table 4 Accent 2" w:uiPriority="49"/>
-    <w:lsdException w:name="List Table 5 Dark Accent 2" w:uiPriority="50"/>
-    <w:lsdException w:name="List Table 6 Colorful Accent 2" w:uiPriority="51"/>
-    <w:lsdException w:name="List Table 7 Colorful Accent 2" w:uiPriority="52"/>
-    <w:lsdException w:name="List Table 1 Light Accent 3" w:uiPriority="46"/>
-    <w:lsdException w:name="List Table 2 Accent 3" w:uiPriority="47"/>
-    <w:lsdException w:name="List Table 3 Accent 3" w:uiPriority="48"/>
-    <w:lsdException w:name="List Table 4 Accent 3" w:uiPriority="49"/>
-    <w:lsdException w:name="List Table 5 Dark Accent 3" w:uiPriority="50"/>
-    <w:lsdException w:name="List Table 6 Colorful Accent 3" w:uiPriority="51"/>
-    <w:lsdException w:name="List Table 7 Colorful Accent 3" w:uiPriority="52"/>
-    <w:lsdException w:name="List Table 1 Light Accent 4" w:uiPriority="46"/>
-    <w:lsdException w:name="List Table 2 Accent 4" w:uiPriority="47"/>
-    <w:lsdException w:name="List Table 3 Accent 4" w:uiPriority="48"/>
-    <w:lsdException w:name="List Table 4 Accent 4" w:uiPriority="49"/>
-    <w:lsdException w:name="List Table 5 Dark Accent 4" w:uiPriority="50"/>
-    <w:lsdException w:name="List Table 6 Colorful Accent 4" w:uiPriority="51"/>
-    <w:lsdException w:name="List Table 7 Colorful Accent 4" w:uiPriority="52"/>
-    <w:lsdException w:name="List Table 1 Light Accent 5" w:uiPriority="46"/>
-    <w:lsdException w:name="List Table 2 Accent 5" w:uiPriority="47"/>
-    <w:lsdException w:name="List Table 3 Accent 5" w:uiPriority="48"/>
-    <w:lsdException w:name="List Table 4 Accent 5" w:uiPriority="49"/>
-    <w:lsdException w:name="List Table 5 Dark Accent 5" w:uiPriority="50"/>
-    <w:lsdException w:name="List Table 6 Colorful Accent 5" w:uiPriority="51"/>
-    <w:lsdException w:name="List Table 7 Colorful Accent 5" w:uiPriority="52"/>
-    <w:lsdException w:name="List Table 1 Light Accent 6" w:uiPriority="46"/>
-    <w:lsdException w:name="List Table 2 Accent 6" w:uiPriority="47"/>
-    <w:lsdException w:name="List Table 3 Accent 6" w:uiPriority="48"/>
-    <w:lsdException w:name="List Table 4 Accent 6" w:uiPriority="49"/>
-    <w:lsdException w:name="List Table 5 Dark Accent 6" w:uiPriority="50"/>
-    <w:lsdException w:name="List Table 6 Colorful Accent 6" w:uiPriority="51"/>
-    <w:lsdException w:name="List Table 7 Colorful Accent 6" w:uiPriority="52"/>
-    <w:lsdException w:name="Mention" w:semiHidden="1" w:unhideWhenUsed="1"/>
-    <w:lsdException w:name="Smart Hyperlink" w:semiHidden="1" w:unhideWhenUsed="1"/>
-    <w:lsdException w:name="Hashtag" w:semiHidden="1" w:unhideWhenUsed="1"/>
-    <w:lsdException w:name="Unresolved Mention" w:semiHidden="1" w:unhideWhenUsed="1"/>
-    <w:lsdException w:name="Smart Link" w:semiHidden="1" w:unhideWhenUsed="1"/>
+  <w:latentStyles w:defLockedState="0" w:defUIPriority="99" w:defSemiHidden="1" w:defUnhideWhenUsed="1" w:defQFormat="0" w:count="267">
+    <w:lsdException w:name="Normal" w:semiHidden="0" w:uiPriority="0" w:unhideWhenUsed="0" w:qFormat="1"/>
+    <w:lsdException w:name="heading 1" w:semiHidden="0" w:uiPriority="9" w:unhideWhenUsed="0" w:qFormat="1"/>
+    <w:lsdException w:name="heading 2" w:uiPriority="9" w:qFormat="1"/>
+    <w:lsdException w:name="heading 3" w:uiPriority="9" w:qFormat="1"/>
+    <w:lsdException w:name="heading 4" w:uiPriority="9" w:qFormat="1"/>
+    <w:lsdException w:name="heading 5" w:uiPriority="9" w:qFormat="1"/>
+    <w:lsdException w:name="heading 6" w:uiPriority="9" w:qFormat="1"/>
+    <w:lsdException w:name="heading 7" w:uiPriority="9" w:qFormat="1"/>
+    <w:lsdException w:name="heading 8" w:uiPriority="9" w:qFormat="1"/>
+    <w:lsdException w:name="heading 9" w:uiPriority="9" w:qFormat="1"/>
+    <w:lsdException w:name="toc 1" w:uiPriority="39"/>
+    <w:lsdException w:name="toc 2" w:uiPriority="39"/>
+    <w:lsdException w:name="toc 3" w:uiPriority="39"/>
+    <w:lsdException w:name="toc 4" w:uiPriority="39"/>
+    <w:lsdException w:name="toc 5" w:uiPriority="39"/>
+    <w:lsdException w:name="toc 6" w:uiPriority="39"/>
+    <w:lsdException w:name="toc 7" w:uiPriority="39"/>
+    <w:lsdException w:name="toc 8" w:uiPriority="39"/>
+    <w:lsdException w:name="toc 9" w:uiPriority="39"/>
+    <w:lsdException w:name="caption" w:uiPriority="35" w:qFormat="1"/>
+    <w:lsdException w:name="Title" w:semiHidden="0" w:uiPriority="10" w:unhideWhenUsed="0" w:qFormat="1"/>
+    <w:lsdException w:name="Default Paragraph Font" w:uiPriority="1"/>
+    <w:lsdException w:name="Subtitle" w:semiHidden="0" w:uiPriority="11" w:unhideWhenUsed="0" w:qFormat="1"/>
+    <w:lsdException w:name="Strong" w:semiHidden="0" w:uiPriority="22" w:unhideWhenUsed="0" w:qFormat="1"/>
+    <w:lsdException w:name="Emphasis" w:semiHidden="0" w:uiPriority="20" w:unhideWhenUsed="0" w:qFormat="1"/>
+    <w:lsdException w:name="Table Grid" w:semiHidden="0" w:uiPriority="59" w:unhideWhenUsed="0"/>
+    <w:lsdException w:name="Placeholder Text" w:unhideWhenUsed="0"/>
+    <w:lsdException w:name="No Spacing" w:semiHidden="0" w:uiPriority="1" w:unhideWhenUsed="0" w:qFormat="1"/>
+    <w:lsdException w:name="Light Shading" w:semiHidden="0" w:uiPriority="60" w:unhideWhenUsed="0"/>
+    <w:lsdException w:name="Light List" w:semiHidden="0" w:uiPriority="61" w:unhideWhenUsed="0"/>
+    <w:lsdException w:name="Light Grid" w:semiHidden="0" w:uiPriority="62" w:unhideWhenUsed="0"/>
+    <w:lsdException w:name="Medium Shading 1" w:semiHidden="0" w:uiPriority="63" w:unhideWhenUsed="0"/>
+    <w:lsdException w:name="Medium Shading 2" w:semiHidden="0" w:uiPriority="64" w:unhideWhenUsed="0"/>
+    <w:lsdException w:name="Medium List 1" w:semiHidden="0" w:uiPriority="65" w:unhideWhenUsed="0"/>
+    <w:lsdException w:name="Medium List 2" w:semiHidden="0" w:uiPriority="66" w:unhideWhenUsed="0"/>
+    <w:lsdException w:name="Medium Grid 1" w:semiHidden="0" w:uiPriority="67" w:unhideWhenUsed="0"/>
+    <w:lsdException w:name="Medium Grid 2" w:semiHidden="0" w:uiPriority="68" w:unhideWhenUsed="0"/>
+    <w:lsdException w:name="Medium Grid 3" w:semiHidden="0" w:uiPriority="69" w:unhideWhenUsed="0"/>
+    <w:lsdException w:name="Dark List" w:semiHidden="0" w:uiPriority="70" w:unhideWhenUsed="0"/>
+    <w:lsdException w:name="Colorful Shading" w:semiHidden="0" w:uiPriority="71" w:unhideWhenUsed="0"/>
+    <w:lsdException w:name="Colorful List" w:semiHidden="0" w:uiPriority="72" w:unhideWhenUsed="0"/>
+    <w:lsdException w:name="Colorful Grid" w:semiHidden="0" w:uiPriority="73" w:unhideWhenUsed="0"/>
+    <w:lsdException w:name="Light Shading Accent 1" w:semiHidden="0" w:uiPriority="60" w:unhideWhenUsed="0"/>
+    <w:lsdException w:name="Light List Accent 1" w:semiHidden="0" w:uiPriority="61" w:unhideWhenUsed="0"/>
+    <w:lsdException w:name="Light Grid Accent 1" w:semiHidden="0" w:uiPriority="62" w:unhideWhenUsed="0"/>
+    <w:lsdException w:name="Medium Shading 1 Accent 1" w:semiHidden="0" w:uiPriority="63" w:unhideWhenUsed="0"/>
+    <w:lsdException w:name="Medium Shading 2 Accent 1" w:semiHidden="0" w:uiPriority="64" w:unhideWhenUsed="0"/>
+    <w:lsdException w:name="Medium List 1 Accent 1" w:semiHidden="0" w:uiPriority="65" w:unhideWhenUsed="0"/>
+    <w:lsdException w:name="Revision" w:unhideWhenUsed="0"/>
+    <w:lsdException w:name="List Paragraph" w:semiHidden="0" w:uiPriority="34" w:unhideWhenUsed="0" w:qFormat="1"/>
+    <w:lsdException w:name="Quote" w:semiHidden="0" w:uiPriority="29" w:unhideWhenUsed="0" w:qFormat="1"/>
+    <w:lsdException w:name="Intense Quote" w:semiHidden="0" w:uiPriority="30" w:unhideWhenUsed="0" w:qFormat="1"/>
+    <w:lsdException w:name="Medium List 2 Accent 1" w:semiHidden="0" w:uiPriority="66" w:unhideWhenUsed="0"/>
+    <w:lsdException w:name="Medium Grid 1 Accent 1" w:semiHidden="0" w:uiPriority="67" w:unhideWhenUsed="0"/>
+    <w:lsdException w:name="Medium Grid 2 Accent 1" w:semiHidden="0" w:uiPriority="68" w:unhideWhenUsed="0"/>
+    <w:lsdException w:name="Medium Grid 3 Accent 1" w:semiHidden="0" w:uiPriority="69" w:unhideWhenUsed="0"/>
+    <w:lsdException w:name="Dark List Accent 1" w:semiHidden="0" w:uiPriority="70" w:unhideWhenUsed="0"/>
+    <w:lsdException w:name="Colorful Shading Accent 1" w:semiHidden="0" w:uiPriority="71" w:unhideWhenUsed="0"/>
+    <w:lsdException w:name="Colorful List Accent 1" w:semiHidden="0" w:uiPriority="72" w:unhideWhenUsed="0"/>
+    <w:lsdException w:name="Colorful Grid Accent 1" w:semiHidden="0" w:uiPriority="73" w:unhideWhenUsed="0"/>
+    <w:lsdException w:name="Light Shading Accent 2" w:semiHidden="0" w:uiPriority="60" w:unhideWhenUsed="0"/>
+    <w:lsdException w:name="Light List Accent 2" w:semiHidden="0" w:uiPriority="61" w:unhideWhenUsed="0"/>
+    <w:lsdException w:name="Light Grid Accent 2" w:semiHidden="0" w:uiPriority="62" w:unhideWhenUsed="0"/>
+    <w:lsdException w:name="Medium Shading 1 Accent 2" w:semiHidden="0" w:uiPriority="63" w:unhideWhenUsed="0"/>
+    <w:lsdException w:name="Medium Shading 2 Accent 2" w:semiHidden="0" w:uiPriority="64" w:unhideWhenUsed="0"/>
+    <w:lsdException w:name="Medium List 1 Accent 2" w:semiHidden="0" w:uiPriority="65" w:unhideWhenUsed="0"/>
+    <w:lsdException w:name="Medium List 2 Accent 2" w:semiHidden="0" w:uiPriority="66" w:unhideWhenUsed="0"/>
+    <w:lsdException w:name="Medium Grid 1 Accent 2" w:semiHidden="0" w:uiPriority="67" w:unhideWhenUsed="0"/>
+    <w:lsdException w:name="Medium Grid 2 Accent 2" w:semiHidden="0" w:uiPriority="68" w:unhideWhenUsed="0"/>
+    <w:lsdException w:name="Medium Grid 3 Accent 2" w:semiHidden="0" w:uiPriority="69" w:unhideWhenUsed="0"/>
+    <w:lsdException w:name="Dark List Accent 2" w:semiHidden="0" w:uiPriority="70" w:unhideWhenUsed="0"/>
+    <w:lsdException w:name="Colorful Shading Accent 2" w:semiHidden="0" w:uiPriority="71" w:unhideWhenUsed="0"/>
+    <w:lsdException w:name="Colorful List Accent 2" w:semiHidden="0" w:uiPriority="72" w:unhideWhenUsed="0"/>
+    <w:lsdException w:name="Colorful Grid Accent 2" w:semiHidden="0" w:uiPriority="73" w:unhideWhenUsed="0"/>
+    <w:lsdException w:name="Light Shading Accent 3" w:semiHidden="0" w:uiPriority="60" w:unhideWhenUsed="0"/>
+    <w:lsdException w:name="Light List Accent 3" w:semiHidden="0" w:uiPriority="61" w:unhideWhenUsed="0"/>
+    <w:lsdException w:name="Light Grid Accent 3" w:semiHidden="0" w:uiPriority="62" w:unhideWhenUsed="0"/>
+    <w:lsdException w:name="Medium Shading 1 Accent 3" w:semiHidden="0" w:uiPriority="63" w:unhideWhenUsed="0"/>
+    <w:lsdException w:name="Medium Shading 2 Accent 3" w:semiHidden="0" w:uiPriority="64" w:unhideWhenUsed="0"/>
+    <w:lsdException w:name="Medium List 1 Accent 3" w:semiHidden="0" w:uiPriority="65" w:unhideWhenUsed="0"/>
+    <w:lsdException w:name="Medium List 2 Accent 3" w:semiHidden="0" w:uiPriority="66" w:unhideWhenUsed="0"/>
+    <w:lsdException w:name="Medium Grid 1 Accent 3" w:semiHidden="0" w:uiPriority="67" w:unhideWhenUsed="0"/>
+    <w:lsdException w:name="Medium Grid 2 Accent 3" w:semiHidden="0" w:uiPriority="68" w:unhideWhenUsed="0"/>
+    <w:lsdException w:name="Medium Grid 3 Accent 3" w:semiHidden="0" w:uiPriority="69" w:unhideWhenUsed="0"/>
+    <w:lsdException w:name="Dark List Accent 3" w:semiHidden="0" w:uiPriority="70" w:unhideWhenUsed="0"/>
+    <w:lsdException w:name="Colorful Shading Accent 3" w:semiHidden="0" w:uiPriority="71" w:unhideWhenUsed="0"/>
+    <w:lsdException w:name="Colorful List Accent 3" w:semiHidden="0" w:uiPriority="72" w:unhideWhenUsed="0"/>
+    <w:lsdException w:name="Colorful Grid Accent 3" w:semiHidden="0" w:uiPriority="73" w:unhideWhenUsed="0"/>
+    <w:lsdException w:name="Light Shading Accent 4" w:semiHidden="0" w:uiPriority="60" w:unhideWhenUsed="0"/>
+    <w:lsdException w:name="Light List Accent 4" w:semiHidden="0" w:uiPriority="61" w:unhideWhenUsed="0"/>
+    <w:lsdException w:name="Light Grid Accent 4" w:semiHidden="0" w:uiPriority="62" w:unhideWhenUsed="0"/>
+    <w:lsdException w:name="Medium Shading 1 Accent 4" w:semiHidden="0" w:uiPriority="63" w:unhideWhenUsed="0"/>
+    <w:lsdException w:name="Medium Shading 2 Accent 4" w:semiHidden="0" w:uiPriority="64" w:unhideWhenUsed="0"/>
+    <w:lsdException w:name="Medium List 1 Accent 4" w:semiHidden="0" w:uiPriority="65" w:unhideWhenUsed="0"/>
+    <w:lsdException w:name="Medium List 2 Accent 4" w:semiHidden="0" w:uiPriority="66" w:unhideWhenUsed="0"/>
+    <w:lsdException w:name="Medium Grid 1 Accent 4" w:semiHidden="0" w:uiPriority="67" w:unhideWhenUsed="0"/>
+    <w:lsdException w:name="Medium Grid 2 Accent 4" w:semiHidden="0" w:uiPriority="68" w:unhideWhenUsed="0"/>
+    <w:lsdException w:name="Medium Grid 3 Accent 4" w:semiHidden="0" w:uiPriority="69" w:unhideWhenUsed="0"/>
+    <w:lsdException w:name="Dark List Accent 4" w:semiHidden="0" w:uiPriority="70" w:unhideWhenUsed="0"/>
+    <w:lsdException w:name="Colorful Shading Accent 4" w:semiHidden="0" w:uiPriority="71" w:unhideWhenUsed="0"/>
+    <w:lsdException w:name="Colorful List Accent 4" w:semiHidden="0" w:uiPriority="72" w:unhideWhenUsed="0"/>
+    <w:lsdException w:name="Colorful Grid Accent 4" w:semiHidden="0" w:uiPriority="73" w:unhideWhenUsed="0"/>
+    <w:lsdException w:name="Light Shading Accent 5" w:semiHidden="0" w:uiPriority="60" w:unhideWhenUsed="0"/>
+    <w:lsdException w:name="Light List Accent 5" w:semiHidden="0" w:uiPriority="61" w:unhideWhenUsed="0"/>
+    <w:lsdException w:name="Light Grid Accent 5" w:semiHidden="0" w:uiPriority="62" w:unhideWhenUsed="0"/>
+    <w:lsdException w:name="Medium Shading 1 Accent 5" w:semiHidden="0" w:uiPriority="63" w:unhideWhenUsed="0"/>
+    <w:lsdException w:name="Medium Shading 2 Accent 5" w:semiHidden="0" w:uiPriority="64" w:unhideWhenUsed="0"/>
+    <w:lsdException w:name="Medium List 1 Accent 5" w:semiHidden="0" w:uiPriority="65" w:unhideWhenUsed="0"/>
+    <w:lsdException w:name="Medium List 2 Accent 5" w:semiHidden="0" w:uiPriority="66" w:unhideWhenUsed="0"/>
+    <w:lsdException w:name="Medium Grid 1 Accent 5" w:semiHidden="0" w:uiPriority="67" w:unhideWhenUsed="0"/>
+    <w:lsdException w:name="Medium Grid 2 Accent 5" w:semiHidden="0" w:uiPriority="68" w:unhideWhenUsed="0"/>
+    <w:lsdException w:name="Medium Grid 3 Accent 5" w:semiHidden="0" w:uiPriority="69" w:unhideWhenUsed="0"/>
+    <w:lsdException w:name="Dark List Accent 5" w:semiHidden="0" w:uiPriority="70" w:unhideWhenUsed="0"/>
+    <w:lsdException w:name="Colorful Shading Accent 5" w:semiHidden="0" w:uiPriority="71" w:unhideWhenUsed="0"/>
+    <w:lsdException w:name="Colorful List Accent 5" w:semiHidden="0" w:uiPriority="72" w:unhideWhenUsed="0"/>
+    <w:lsdException w:name="Colorful Grid Accent 5" w:semiHidden="0" w:uiPriority="73" w:unhideWhenUsed="0"/>
+    <w:lsdException w:name="Light Shading Accent 6" w:semiHidden="0" w:uiPriority="60" w:unhideWhenUsed="0"/>
+    <w:lsdException w:name="Light List Accent 6" w:semiHidden="0" w:uiPriority="61" w:unhideWhenUsed="0"/>
+    <w:lsdException w:name="Light Grid Accent 6" w:semiHidden="0" w:uiPriority="62" w:unhideWhenUsed="0"/>
+    <w:lsdException w:name="Medium Shading 1 Accent 6" w:semiHidden="0" w:uiPriority="63" w:unhideWhenUsed="0"/>
+    <w:lsdException w:name="Medium Shading 2 Accent 6" w:semiHidden="0" w:uiPriority="64" w:unhideWhenUsed="0"/>
+    <w:lsdException w:name="Medium List 1 Accent 6" w:semiHidden="0" w:uiPriority="65" w:unhideWhenUsed="0"/>
+    <w:lsdException w:name="Medium List 2 Accent 6" w:semiHidden="0" w:uiPriority="66" w:unhideWhenUsed="0"/>
+    <w:lsdException w:name="Medium Grid 1 Accent 6" w:semiHidden="0" w:uiPriority="67" w:unhideWhenUsed="0"/>
+    <w:lsdException w:name="Medium Grid 2 Accent 6" w:semiHidden="0" w:uiPriority="68" w:unhideWhenUsed="0"/>
+    <w:lsdException w:name="Medium Grid 3 Accent 6" w:semiHidden="0" w:uiPriority="69" w:unhideWhenUsed="0"/>
+    <w:lsdException w:name="Dark List Accent 6" w:semiHidden="0" w:uiPriority="70" w:unhideWhenUsed="0"/>
+    <w:lsdException w:name="Colorful Shading Accent 6" w:semiHidden="0" w:uiPriority="71" w:unhideWhenUsed="0"/>
+    <w:lsdException w:name="Colorful List Accent 6" w:semiHidden="0" w:uiPriority="72" w:unhideWhenUsed="0"/>
+    <w:lsdException w:name="Colorful Grid Accent 6" w:semiHidden="0" w:uiPriority="73" w:unhideWhenUsed="0"/>
+    <w:lsdException w:name="Subtle Emphasis" w:semiHidden="0" w:uiPriority="19" w:unhideWhenUsed="0" w:qFormat="1"/>
+    <w:lsdException w:name="Intense Emphasis" w:semiHidden="0" w:uiPriority="21" w:unhideWhenUsed="0" w:qFormat="1"/>
+    <w:lsdException w:name="Subtle Reference" w:semiHidden="0" w:uiPriority="31" w:unhideWhenUsed="0" w:qFormat="1"/>
+    <w:lsdException w:name="Intense Reference" w:semiHidden="0" w:uiPriority="32" w:unhideWhenUsed="0" w:qFormat="1"/>
+    <w:lsdException w:name="Book Title" w:semiHidden="0" w:uiPriority="33" w:unhideWhenUsed="0" w:qFormat="1"/>
+    <w:lsdException w:name="Bibliography" w:uiPriority="37"/>
+    <w:lsdException w:name="TOC Heading" w:uiPriority="39" w:qFormat="1"/>
+  </w:latentStyles>
+  <w:style w:type="paragraph" w:default="1" w:styleId="Normal">
+    <w:name w:val="Normal"/>
+    <w:qFormat/>
+    <w:rsid w:val="00E63279"/>
+    <w:pPr>
+      <w:spacing w:after="200" w:line="276" w:lineRule="auto"/>
+    </w:pPr>
+    <w:rPr>
+      <w:kern w:val="0"/>
+      <w:lang w:val="en-CA"/>
+      <w14:ligatures w14:val="none"/>
+    </w:rPr>
+  </w:style>
+  <w:style w:type="paragraph" w:styleId="Heading1">
+    <w:name w:val="heading 1"/>
+    <w:basedOn w:val="Normal"/>
+    <w:next w:val="Normal"/>
+    <w:link w:val="Heading1Char"/>
+    <w:uiPriority w:val="9"/>
+    <w:qFormat/>
+    <w:rsid w:val="00E63279"/>
+    <w:pPr>
+      <w:keepNext/>
+      <w:keepLines/>
+      <w:spacing w:before="240" w:after="0"/>
+      <w:outlineLvl w:val="0"/>
+    </w:pPr>
+    <w:rPr>
+      <w:rFonts w:asciiTheme="majorHAnsi" w:eastAsiaTheme="majorEastAsia" w:hAnsiTheme="majorHAnsi" w:cstheme="majorBidi"/>
+      <w:color w:val="2F5496" w:themeColor="accent1" w:themeShade="BF"/>
+      <w:sz w:val="32"/>
+      <w:szCs w:val="32"/>
+    </w:rPr>
+  </w:style>
+  <w:style w:type="character" w:default="1" w:styleId="DefaultParagraphFont">
+    <w:name w:val="Default Paragraph Font"/>
+    <w:uiPriority w:val="1"/>
+    <w:semiHidden/>
+    <w:unhideWhenUsed/>
+  </w:style>
+  <w:style w:type="table" w:default="1" w:styleId="TableNormal">
+    <w:name w:val="Normal Table"/>
+    <w:uiPriority w:val="99"/>
+    <w:semiHidden/>
+    <w:unhideWhenUsed/>
+    <w:tblPr>
+      <w:tblInd w:w="0" w:type="dxa"/>
+      <w:tblCellMar>
+        <w:top w:w="0" w:type="dxa"/>
+        <w:left w:w="108" w:type="dxa"/>
+        <w:bottom w:w="0" w:type="dxa"/>
+        <w:right w:w="108" w:type="dxa"/>
+      </w:tblCellMar>
+    </w:tblPr>
+  </w:style>
+  <w:style w:type="numbering" w:default="1" w:styleId="NoList">
+    <w:name w:val="No List"/>
+    <w:uiPriority w:val="99"/>
+    <w:semiHidden/>
+    <w:unhideWhenUsed/>
+  </w:style>
+  <w:style w:type="paragraph" w:styleId="Header">
+    <w:name w:val="header"/>
+    <w:basedOn w:val="Normal"/>
+    <w:link w:val="HeaderChar"/>
+    <w:uiPriority w:val="99"/>
+    <w:unhideWhenUsed/>
+    <w:rsid w:val="00E63279"/>
+    <w:pPr>
+      <w:tabs>
+        <w:tab w:val="center" w:pos="4680"/>
+        <w:tab w:val="right" w:pos="9360"/>
+      </w:tabs>
+      <w:spacing w:after="0" w:line="240" w:lineRule="auto"/>
+    </w:pPr>
+    <w:rPr>
+      <w:kern w:val="2"/>
+      <w:lang w:val="en-US"/>
+      <w14:ligatures w14:val="standardContextual"/>
+    </w:rPr>
+  </w:style>
+  <w:style w:type="character" w:customStyle="1" w:styleId="HeaderChar">
+    <w:name w:val="Header Char"/>
+    <w:basedOn w:val="DefaultParagraphFont"/>
+    <w:link w:val="Header"/>
+    <w:uiPriority w:val="99"/>
+    <w:rsid w:val="00E63279"/>
+  </w:style>
+  <w:style w:type="paragraph" w:styleId="Footer">
+    <w:name w:val="footer"/>
+    <w:basedOn w:val="Normal"/>
+    <w:link w:val="FooterChar"/>
+    <w:uiPriority w:val="99"/>
+    <w:unhideWhenUsed/>
+    <w:rsid w:val="00E63279"/>
+    <w:pPr>
+      <w:tabs>
+        <w:tab w:val="center" w:pos="4680"/>
+        <w:tab w:val="right" w:pos="9360"/>
+      </w:tabs>
+      <w:spacing w:after="0" w:line="240" w:lineRule="auto"/>
+    </w:pPr>
+    <w:rPr>
+      <w:kern w:val="2"/>
+      <w:lang w:val="en-US"/>
+      <w14:ligatures w14:val="standardContextual"/>
+    </w:rPr>
+  </w:style>
+  <w:style w:type="character" w:customStyle="1" w:styleId="FooterChar">
+    <w:name w:val="Footer Char"/>
+    <w:basedOn w:val="DefaultParagraphFont"/>
+    <w:link w:val="Footer"/>
+    <w:uiPriority w:val="99"/>
+    <w:rsid w:val="00E63279"/>
+  </w:style>
+  <w:style w:type="character" w:customStyle="1" w:styleId="Heading1Char">
+    <w:name w:val="Heading 1 Char"/>
+    <w:basedOn w:val="DefaultParagraphFont"/>
+    <w:link w:val="Heading1"/>
+    <w:uiPriority w:val="9"/>
+    <w:rsid w:val="00E63279"/>
+    <w:rPr>
+      <w:rFonts w:asciiTheme="majorHAnsi" w:eastAsiaTheme="majorEastAsia" w:hAnsiTheme="majorHAnsi" w:cstheme="majorBidi"/>
+      <w:color w:val="2F5496" w:themeColor="accent1" w:themeShade="BF"/>
+      <w:kern w:val="0"/>
+      <w:sz w:val="32"/>
+      <w:szCs w:val="32"/>
+      <w:lang w:val="en-CA"/>
+      <w14:ligatures w14:val="none"/>
+    </w:rPr>
+  </w:style>
+  <w:style w:type="table" w:styleId="TableGrid">
+    <w:name w:val="Table Grid"/>
+    <w:basedOn w:val="TableNormal"/>
+    <w:uiPriority w:val="59"/>
+    <w:rsid w:val="00E63279"/>
+    <w:pPr>
+      <w:spacing w:after="0" w:line="240" w:lineRule="auto"/>
+    </w:pPr>
+    <w:rPr>
+      <w:kern w:val="0"/>
+      <w:lang w:val="en-CA"/>
+      <w14:ligatures w14:val="none"/>
+    </w:rPr>
+    <w:tblPr>
+      <w:tblBorders>
+        <w:top w:val="single" w:sz="4" w:space="0" w:color="auto"/>
+        <w:left w:val="single" w:sz="4" w:space="0" w:color="auto"/>
+        <w:bottom w:val="single" w:sz="4" w:space="0" w:color="auto"/>
+        <w:right w:val="single" w:sz="4" w:space="0" w:color="auto"/>
+        <w:insideH w:val="single" w:sz="4" w:space="0" w:color="auto"/>
+        <w:insideV w:val="single" w:sz="4" w:space="0" w:color="auto"/>
+      </w:tblBorders>
+    </w:tblPr>
+  </w:style>
+  <w:style w:type="paragraph" w:styleId="ListParagraph">
+    <w:name w:val="List Paragraph"/>
+    <w:basedOn w:val="Normal"/>
+    <w:uiPriority w:val="34"/>
+    <w:qFormat/>
+    <w:rsid w:val="00CE33FE"/>
+    <w:pPr>
+      <w:ind w:left="720"/>
+      <w:contextualSpacing/>
+    </w:pPr>
+  </w:style>
+</w:styles>
+</file>
+
+<file path=word/stylesWithEffects.xml><?xml version="1.0" encoding="utf-8"?>
+<w:styles xmlns:wpc="http://schemas.microsoft.com/office/word/2010/wordprocessingCanvas" xmlns:mc="http://schemas.openxmlformats.org/markup-compatibility/2006" xmlns:o="urn:schemas-microsoft-com:office:office" xmlns:r="http://schemas.openxmlformats.org/officeDocument/2006/relationships" xmlns:m="http://schemas.openxmlformats.org/officeDocument/2006/math" xmlns:v="urn:schemas-microsoft-com:vml" xmlns:wp14="http://schemas.microsoft.com/office/word/2010/wordprocessingDrawing" xmlns:wp="http://schemas.openxmlformats.org/drawingml/2006/wordprocessingDrawing" xmlns:w10="urn:schemas-microsoft-com:office:word" xmlns:w="http://schemas.openxmlformats.org/wordprocessingml/2006/main" xmlns:w14="http://schemas.microsoft.com/office/word/2010/wordml" xmlns:wpg="http://schemas.microsoft.com/office/word/2010/wordprocessingGroup" xmlns:wpi="http://schemas.microsoft.com/office/word/2010/wordprocessingInk" xmlns:wne="http://schemas.microsoft.com/office/word/2006/wordml" xmlns:wps="http://schemas.microsoft.com/office/word/2010/wordprocessingShape" mc:Ignorable="w14 wp14">
+  <w:docDefaults>
+    <w:rPrDefault>
+      <w:rPr>
+        <w:rFonts w:asciiTheme="minorHAnsi" w:eastAsiaTheme="minorHAnsi" w:hAnsiTheme="minorHAnsi" w:cstheme="minorBidi"/>
+        <w:kern w:val="2"/>
+        <w:sz w:val="22"/>
+        <w:szCs w:val="22"/>
+        <w:lang w:val="en-US" w:eastAsia="en-US" w:bidi="ar-SA"/>
+        <w14:ligatures w14:val="standardContextual"/>
+      </w:rPr>
+    </w:rPrDefault>
+    <w:pPrDefault>
+      <w:pPr>
+        <w:spacing w:after="160" w:line="259" w:lineRule="auto"/>
+      </w:pPr>
+    </w:pPrDefault>
+  </w:docDefaults>
+  <w:latentStyles w:defLockedState="0" w:defUIPriority="99" w:defSemiHidden="1" w:defUnhideWhenUsed="1" w:defQFormat="0" w:count="267">
+    <w:lsdException w:name="Normal" w:semiHidden="0" w:uiPriority="0" w:unhideWhenUsed="0" w:qFormat="1"/>
+    <w:lsdException w:name="heading 1" w:semiHidden="0" w:uiPriority="9" w:unhideWhenUsed="0" w:qFormat="1"/>
+    <w:lsdException w:name="heading 2" w:uiPriority="9" w:qFormat="1"/>
+    <w:lsdException w:name="heading 3" w:uiPriority="9" w:qFormat="1"/>
+    <w:lsdException w:name="heading 4" w:uiPriority="9" w:qFormat="1"/>
+    <w:lsdException w:name="heading 5" w:uiPriority="9" w:qFormat="1"/>
+    <w:lsdException w:name="heading 6" w:uiPriority="9" w:qFormat="1"/>
+    <w:lsdException w:name="heading 7" w:uiPriority="9" w:qFormat="1"/>
+    <w:lsdException w:name="heading 8" w:uiPriority="9" w:qFormat="1"/>
+    <w:lsdException w:name="heading 9" w:uiPriority="9" w:qFormat="1"/>
+    <w:lsdException w:name="toc 1" w:uiPriority="39"/>
+    <w:lsdException w:name="toc 2" w:uiPriority="39"/>
+    <w:lsdException w:name="toc 3" w:uiPriority="39"/>
+    <w:lsdException w:name="toc 4" w:uiPriority="39"/>
+    <w:lsdException w:name="toc 5" w:uiPriority="39"/>
+    <w:lsdException w:name="toc 6" w:uiPriority="39"/>
+    <w:lsdException w:name="toc 7" w:uiPriority="39"/>
+    <w:lsdException w:name="toc 8" w:uiPriority="39"/>
+    <w:lsdException w:name="toc 9" w:uiPriority="39"/>
+    <w:lsdException w:name="caption" w:uiPriority="35" w:qFormat="1"/>
+    <w:lsdException w:name="Title" w:semiHidden="0" w:uiPriority="10" w:unhideWhenUsed="0" w:qFormat="1"/>
+    <w:lsdException w:name="Default Paragraph Font" w:uiPriority="1"/>
+    <w:lsdException w:name="Subtitle" w:semiHidden="0" w:uiPriority="11" w:unhideWhenUsed="0" w:qFormat="1"/>
+    <w:lsdException w:name="Strong" w:semiHidden="0" w:uiPriority="22" w:unhideWhenUsed="0" w:qFormat="1"/>
+    <w:lsdException w:name="Emphasis" w:semiHidden="0" w:uiPriority="20" w:unhideWhenUsed="0" w:qFormat="1"/>
+    <w:lsdException w:name="Table Grid" w:semiHidden="0" w:uiPriority="59" w:unhideWhenUsed="0"/>
+    <w:lsdException w:name="Placeholder Text" w:unhideWhenUsed="0"/>
+    <w:lsdException w:name="No Spacing" w:semiHidden="0" w:uiPriority="1" w:unhideWhenUsed="0" w:qFormat="1"/>
+    <w:lsdException w:name="Light Shading" w:semiHidden="0" w:uiPriority="60" w:unhideWhenUsed="0"/>
+    <w:lsdException w:name="Light List" w:semiHidden="0" w:uiPriority="61" w:unhideWhenUsed="0"/>
+    <w:lsdException w:name="Light Grid" w:semiHidden="0" w:uiPriority="62" w:unhideWhenUsed="0"/>
+    <w:lsdException w:name="Medium Shading 1" w:semiHidden="0" w:uiPriority="63" w:unhideWhenUsed="0"/>
+    <w:lsdException w:name="Medium Shading 2" w:semiHidden="0" w:uiPriority="64" w:unhideWhenUsed="0"/>
+    <w:lsdException w:name="Medium List 1" w:semiHidden="0" w:uiPriority="65" w:unhideWhenUsed="0"/>
+    <w:lsdException w:name="Medium List 2" w:semiHidden="0" w:uiPriority="66" w:unhideWhenUsed="0"/>
+    <w:lsdException w:name="Medium Grid 1" w:semiHidden="0" w:uiPriority="67" w:unhideWhenUsed="0"/>
+    <w:lsdException w:name="Medium Grid 2" w:semiHidden="0" w:uiPriority="68" w:unhideWhenUsed="0"/>
+    <w:lsdException w:name="Medium Grid 3" w:semiHidden="0" w:uiPriority="69" w:unhideWhenUsed="0"/>
+    <w:lsdException w:name="Dark List" w:semiHidden="0" w:uiPriority="70" w:unhideWhenUsed="0"/>
+    <w:lsdException w:name="Colorful Shading" w:semiHidden="0" w:uiPriority="71" w:unhideWhenUsed="0"/>
+    <w:lsdException w:name="Colorful List" w:semiHidden="0" w:uiPriority="72" w:unhideWhenUsed="0"/>
+    <w:lsdException w:name="Colorful Grid" w:semiHidden="0" w:uiPriority="73" w:unhideWhenUsed="0"/>
+    <w:lsdException w:name="Light Shading Accent 1" w:semiHidden="0" w:uiPriority="60" w:unhideWhenUsed="0"/>
+    <w:lsdException w:name="Light List Accent 1" w:semiHidden="0" w:uiPriority="61" w:unhideWhenUsed="0"/>
+    <w:lsdException w:name="Light Grid Accent 1" w:semiHidden="0" w:uiPriority="62" w:unhideWhenUsed="0"/>
+    <w:lsdException w:name="Medium Shading 1 Accent 1" w:semiHidden="0" w:uiPriority="63" w:unhideWhenUsed="0"/>
+    <w:lsdException w:name="Medium Shading 2 Accent 1" w:semiHidden="0" w:uiPriority="64" w:unhideWhenUsed="0"/>
+    <w:lsdException w:name="Medium List 1 Accent 1" w:semiHidden="0" w:uiPriority="65" w:unhideWhenUsed="0"/>
+    <w:lsdException w:name="Revision" w:unhideWhenUsed="0"/>
+    <w:lsdException w:name="List Paragraph" w:semiHidden="0" w:uiPriority="34" w:unhideWhenUsed="0" w:qFormat="1"/>
+    <w:lsdException w:name="Quote" w:semiHidden="0" w:uiPriority="29" w:unhideWhenUsed="0" w:qFormat="1"/>
+    <w:lsdException w:name="Intense Quote" w:semiHidden="0" w:uiPriority="30" w:unhideWhenUsed="0" w:qFormat="1"/>
+    <w:lsdException w:name="Medium List 2 Accent 1" w:semiHidden="0" w:uiPriority="66" w:unhideWhenUsed="0"/>
+    <w:lsdException w:name="Medium Grid 1 Accent 1" w:semiHidden="0" w:uiPriority="67" w:unhideWhenUsed="0"/>
+    <w:lsdException w:name="Medium Grid 2 Accent 1" w:semiHidden="0" w:uiPriority="68" w:unhideWhenUsed="0"/>
+    <w:lsdException w:name="Medium Grid 3 Accent 1" w:semiHidden="0" w:uiPriority="69" w:unhideWhenUsed="0"/>
+    <w:lsdException w:name="Dark List Accent 1" w:semiHidden="0" w:uiPriority="70" w:unhideWhenUsed="0"/>
+    <w:lsdException w:name="Colorful Shading Accent 1" w:semiHidden="0" w:uiPriority="71" w:unhideWhenUsed="0"/>
+    <w:lsdException w:name="Colorful List Accent 1" w:semiHidden="0" w:uiPriority="72" w:unhideWhenUsed="0"/>
+    <w:lsdException w:name="Colorful Grid Accent 1" w:semiHidden="0" w:uiPriority="73" w:unhideWhenUsed="0"/>
+    <w:lsdException w:name="Light Shading Accent 2" w:semiHidden="0" w:uiPriority="60" w:unhideWhenUsed="0"/>
+    <w:lsdException w:name="Light List Accent 2" w:semiHidden="0" w:uiPriority="61" w:unhideWhenUsed="0"/>
+    <w:lsdException w:name="Light Grid Accent 2" w:semiHidden="0" w:uiPriority="62" w:unhideWhenUsed="0"/>
+    <w:lsdException w:name="Medium Shading 1 Accent 2" w:semiHidden="0" w:uiPriority="63" w:unhideWhenUsed="0"/>
+    <w:lsdException w:name="Medium Shading 2 Accent 2" w:semiHidden="0" w:uiPriority="64" w:unhideWhenUsed="0"/>
+    <w:lsdException w:name="Medium List 1 Accent 2" w:semiHidden="0" w:uiPriority="65" w:unhideWhenUsed="0"/>
+    <w:lsdException w:name="Medium List 2 Accent 2" w:semiHidden="0" w:uiPriority="66" w:unhideWhenUsed="0"/>
+    <w:lsdException w:name="Medium Grid 1 Accent 2" w:semiHidden="0" w:uiPriority="67" w:unhideWhenUsed="0"/>
+    <w:lsdException w:name="Medium Grid 2 Accent 2" w:semiHidden="0" w:uiPriority="68" w:unhideWhenUsed="0"/>
+    <w:lsdException w:name="Medium Grid 3 Accent 2" w:semiHidden="0" w:uiPriority="69" w:unhideWhenUsed="0"/>
+    <w:lsdException w:name="Dark List Accent 2" w:semiHidden="0" w:uiPriority="70" w:unhideWhenUsed="0"/>
+    <w:lsdException w:name="Colorful Shading Accent 2" w:semiHidden="0" w:uiPriority="71" w:unhideWhenUsed="0"/>
+    <w:lsdException w:name="Colorful List Accent 2" w:semiHidden="0" w:uiPriority="72" w:unhideWhenUsed="0"/>
+    <w:lsdException w:name="Colorful Grid Accent 2" w:semiHidden="0" w:uiPriority="73" w:unhideWhenUsed="0"/>
+    <w:lsdException w:name="Light Shading Accent 3" w:semiHidden="0" w:uiPriority="60" w:unhideWhenUsed="0"/>
+    <w:lsdException w:name="Light List Accent 3" w:semiHidden="0" w:uiPriority="61" w:unhideWhenUsed="0"/>
+    <w:lsdException w:name="Light Grid Accent 3" w:semiHidden="0" w:uiPriority="62" w:unhideWhenUsed="0"/>
+    <w:lsdException w:name="Medium Shading 1 Accent 3" w:semiHidden="0" w:uiPriority="63" w:unhideWhenUsed="0"/>
+    <w:lsdException w:name="Medium Shading 2 Accent 3" w:semiHidden="0" w:uiPriority="64" w:unhideWhenUsed="0"/>
+    <w:lsdException w:name="Medium List 1 Accent 3" w:semiHidden="0" w:uiPriority="65" w:unhideWhenUsed="0"/>
+    <w:lsdException w:name="Medium List 2 Accent 3" w:semiHidden="0" w:uiPriority="66" w:unhideWhenUsed="0"/>
+    <w:lsdException w:name="Medium Grid 1 Accent 3" w:semiHidden="0" w:uiPriority="67" w:unhideWhenUsed="0"/>
+    <w:lsdException w:name="Medium Grid 2 Accent 3" w:semiHidden="0" w:uiPriority="68" w:unhideWhenUsed="0"/>
+    <w:lsdException w:name="Medium Grid 3 Accent 3" w:semiHidden="0" w:uiPriority="69" w:unhideWhenUsed="0"/>
+    <w:lsdException w:name="Dark List Accent 3" w:semiHidden="0" w:uiPriority="70" w:unhideWhenUsed="0"/>
+    <w:lsdException w:name="Colorful Shading Accent 3" w:semiHidden="0" w:uiPriority="71" w:unhideWhenUsed="0"/>
+    <w:lsdException w:name="Colorful List Accent 3" w:semiHidden="0" w:uiPriority="72" w:unhideWhenUsed="0"/>
+    <w:lsdException w:name="Colorful Grid Accent 3" w:semiHidden="0" w:uiPriority="73" w:unhideWhenUsed="0"/>
+    <w:lsdException w:name="Light Shading Accent 4" w:semiHidden="0" w:uiPriority="60" w:unhideWhenUsed="0"/>
+    <w:lsdException w:name="Light List Accent 4" w:semiHidden="0" w:uiPriority="61" w:unhideWhenUsed="0"/>
+    <w:lsdException w:name="Light Grid Accent 4" w:semiHidden="0" w:uiPriority="62" w:unhideWhenUsed="0"/>
+    <w:lsdException w:name="Medium Shading 1 Accent 4" w:semiHidden="0" w:uiPriority="63" w:unhideWhenUsed="0"/>
+    <w:lsdException w:name="Medium Shading 2 Accent 4" w:semiHidden="0" w:uiPriority="64" w:unhideWhenUsed="0"/>
+    <w:lsdException w:name="Medium List 1 Accent 4" w:semiHidden="0" w:uiPriority="65" w:unhideWhenUsed="0"/>
+    <w:lsdException w:name="Medium List 2 Accent 4" w:semiHidden="0" w:uiPriority="66" w:unhideWhenUsed="0"/>
+    <w:lsdException w:name="Medium Grid 1 Accent 4" w:semiHidden="0" w:uiPriority="67" w:unhideWhenUsed="0"/>
+    <w:lsdException w:name="Medium Grid 2 Accent 4" w:semiHidden="0" w:uiPriority="68" w:unhideWhenUsed="0"/>
+    <w:lsdException w:name="Medium Grid 3 Accent 4" w:semiHidden="0" w:uiPriority="69" w:unhideWhenUsed="0"/>
+    <w:lsdException w:name="Dark List Accent 4" w:semiHidden="0" w:uiPriority="70" w:unhideWhenUsed="0"/>
+    <w:lsdException w:name="Colorful Shading Accent 4" w:semiHidden="0" w:uiPriority="71" w:unhideWhenUsed="0"/>
+    <w:lsdException w:name="Colorful List Accent 4" w:semiHidden="0" w:uiPriority="72" w:unhideWhenUsed="0"/>
+    <w:lsdException w:name="Colorful Grid Accent 4" w:semiHidden="0" w:uiPriority="73" w:unhideWhenUsed="0"/>
+    <w:lsdException w:name="Light Shading Accent 5" w:semiHidden="0" w:uiPriority="60" w:unhideWhenUsed="0"/>
+    <w:lsdException w:name="Light List Accent 5" w:semiHidden="0" w:uiPriority="61" w:unhideWhenUsed="0"/>
+    <w:lsdException w:name="Light Grid Accent 5" w:semiHidden="0" w:uiPriority="62" w:unhideWhenUsed="0"/>
+    <w:lsdException w:name="Medium Shading 1 Accent 5" w:semiHidden="0" w:uiPriority="63" w:unhideWhenUsed="0"/>
+    <w:lsdException w:name="Medium Shading 2 Accent 5" w:semiHidden="0" w:uiPriority="64" w:unhideWhenUsed="0"/>
+    <w:lsdException w:name="Medium List 1 Accent 5" w:semiHidden="0" w:uiPriority="65" w:unhideWhenUsed="0"/>
+    <w:lsdException w:name="Medium List 2 Accent 5" w:semiHidden="0" w:uiPriority="66" w:unhideWhenUsed="0"/>
+    <w:lsdException w:name="Medium Grid 1 Accent 5" w:semiHidden="0" w:uiPriority="67" w:unhideWhenUsed="0"/>
+    <w:lsdException w:name="Medium Grid 2 Accent 5" w:semiHidden="0" w:uiPriority="68" w:unhideWhenUsed="0"/>
+    <w:lsdException w:name="Medium Grid 3 Accent 5" w:semiHidden="0" w:uiPriority="69" w:unhideWhenUsed="0"/>
+    <w:lsdException w:name="Dark List Accent 5" w:semiHidden="0" w:uiPriority="70" w:unhideWhenUsed="0"/>
+    <w:lsdException w:name="Colorful Shading Accent 5" w:semiHidden="0" w:uiPriority="71" w:unhideWhenUsed="0"/>
+    <w:lsdException w:name="Colorful List Accent 5" w:semiHidden="0" w:uiPriority="72" w:unhideWhenUsed="0"/>
+    <w:lsdException w:name="Colorful Grid Accent 5" w:semiHidden="0" w:uiPriority="73" w:unhideWhenUsed="0"/>
+    <w:lsdException w:name="Light Shading Accent 6" w:semiHidden="0" w:uiPriority="60" w:unhideWhenUsed="0"/>
+    <w:lsdException w:name="Light List Accent 6" w:semiHidden="0" w:uiPriority="61" w:unhideWhenUsed="0"/>
+    <w:lsdException w:name="Light Grid Accent 6" w:semiHidden="0" w:uiPriority="62" w:unhideWhenUsed="0"/>
+    <w:lsdException w:name="Medium Shading 1 Accent 6" w:semiHidden="0" w:uiPriority="63" w:unhideWhenUsed="0"/>
+    <w:lsdException w:name="Medium Shading 2 Accent 6" w:semiHidden="0" w:uiPriority="64" w:unhideWhenUsed="0"/>
+    <w:lsdException w:name="Medium List 1 Accent 6" w:semiHidden="0" w:uiPriority="65" w:unhideWhenUsed="0"/>
+    <w:lsdException w:name="Medium List 2 Accent 6" w:semiHidden="0" w:uiPriority="66" w:unhideWhenUsed="0"/>
+    <w:lsdException w:name="Medium Grid 1 Accent 6" w:semiHidden="0" w:uiPriority="67" w:unhideWhenUsed="0"/>
+    <w:lsdException w:name="Medium Grid 2 Accent 6" w:semiHidden="0" w:uiPriority="68" w:unhideWhenUsed="0"/>
+    <w:lsdException w:name="Medium Grid 3 Accent 6" w:semiHidden="0" w:uiPriority="69" w:unhideWhenUsed="0"/>
+    <w:lsdException w:name="Dark List Accent 6" w:semiHidden="0" w:uiPriority="70" w:unhideWhenUsed="0"/>
+    <w:lsdException w:name="Colorful Shading Accent 6" w:semiHidden="0" w:uiPriority="71" w:unhideWhenUsed="0"/>
+    <w:lsdException w:name="Colorful List Accent 6" w:semiHidden="0" w:uiPriority="72" w:unhideWhenUsed="0"/>
+    <w:lsdException w:name="Colorful Grid Accent 6" w:semiHidden="0" w:uiPriority="73" w:unhideWhenUsed="0"/>
+    <w:lsdException w:name="Subtle Emphasis" w:semiHidden="0" w:uiPriority="19" w:unhideWhenUsed="0" w:qFormat="1"/>
+    <w:lsdException w:name="Intense Emphasis" w:semiHidden="0" w:uiPriority="21" w:unhideWhenUsed="0" w:qFormat="1"/>
+    <w:lsdException w:name="Subtle Reference" w:semiHidden="0" w:uiPriority="31" w:unhideWhenUsed="0" w:qFormat="1"/>
+    <w:lsdException w:name="Intense Reference" w:semiHidden="0" w:uiPriority="32" w:unhideWhenUsed="0" w:qFormat="1"/>
+    <w:lsdException w:name="Book Title" w:semiHidden="0" w:uiPriority="33" w:unhideWhenUsed="0" w:qFormat="1"/>
+    <w:lsdException w:name="Bibliography" w:uiPriority="37"/>
+    <w:lsdException w:name="TOC Heading" w:uiPriority="39" w:qFormat="1"/>
   </w:latentStyles>
   <w:style w:type="paragraph" w:default="1" w:styleId="Normal">
     <w:name w:val="Normal"/>
@@ -3133,7 +3385,7 @@
   <a:extraClrSchemeLst/>
   <a:extLst>
     <a:ext uri="{05A4C25C-085E-4340-85A3-A5531E510DB2}">
-      <thm15:themeFamily xmlns:thm15="http://schemas.microsoft.com/office/thememl/2012/main" name="Office Theme" id="{62F939B6-93AF-4DB8-9C6B-D6C7DFDC589F}" vid="{4A3C46E8-61CC-4603-A589-7422A47A8E4A}"/>
+      <thm15:themeFamily xmlns:thm15="http://schemas.microsoft.com/office/thememl/2012/main" xmlns="" name="Office Theme" id="{62F939B6-93AF-4DB8-9C6B-D6C7DFDC589F}" vid="{4A3C46E8-61CC-4603-A589-7422A47A8E4A}"/>
     </a:ext>
   </a:extLst>
 </a:theme>

</xml_diff>